<commit_message>
Split backend and ML into their own repositories
backend/ is now CaviNet-Backend and ml/ is CaviNet-ML, included here as
git submodules so paths, make commands and docker compose are unchanged.
make up fetches the submodules when they are missing. Backend and ML
tests run in their repositories' CI; this CI keeps the frontend,
traceability, dependency scan and full-stack jobs.

Also regenerates the scope document .docx from build.js.
</commit_message>
<xml_diff>
--- a/docs/scope/CaviNet_Scope_Document_v2.docx
+++ b/docs/scope/CaviNet_Scope_Document_v2.docx
@@ -104,7 +104,7 @@
           <w:sz w:val="22"/>
           <w:szCs w:val="22"/>
         </w:rPr>
-        <w:t xml:space="preserve">Also serves as the PRD basis and the phased implementation plan for Claude Code</w:t>
+        <w:t xml:space="preserve">Also serves as the PRD basis and the phased implementation plan</w:t>
       </w:r>
     </w:p>
     <w:p>
@@ -773,7 +773,7 @@
               <w:spacing w:after="40"/>
             </w:pPr>
             <w:r>
-              <w:t xml:space="preserve">Revised after dataset investigation: no public cavity annotations exist for the chosen dataset. Objective changed to TB vs NTM differentiation with a calibrated confidence score. Added PRD-level requirements and a 12-phase implementation plan executed by Claude Code. Implementation repository: github.com/ahmadraza225/CaviNet_V1.</w:t>
+              <w:t xml:space="preserve">Revised after dataset investigation: no public cavity annotations exist for the chosen dataset. Objective changed to TB vs NTM differentiation with a calibrated confidence score. Added PRD-level requirements and a 12-phase implementation plan. Implementation repository: github.com/ahmadraza225/CaviNet_V1.</w:t>
             </w:r>
           </w:p>
         </w:tc>
@@ -784,9 +784,11 @@
         <w:pStyle w:val="Heading1"/>
         <w:pageBreakBefore/>
       </w:pPr>
+      <w:bookmarkStart w:name="_Toc1" w:id="1"/>
       <w:r>
         <w:t xml:space="preserve">Supervisor Meeting Log</w:t>
       </w:r>
+      <w:bookmarkEnd w:id="1"/>
     </w:p>
     <w:tbl>
       <w:tblPr>
@@ -1261,9 +1263,11 @@
       <w:pPr>
         <w:pStyle w:val="Heading1"/>
       </w:pPr>
+      <w:bookmarkStart w:name="_Toc2" w:id="2"/>
       <w:r>
         <w:t xml:space="preserve">Table of Contents</w:t>
       </w:r>
+      <w:bookmarkEnd w:id="2"/>
     </w:p>
     <w:sdt>
       <w:sdtPr>
@@ -1271,11 +1275,1756 @@
       </w:sdtPr>
       <w:sdtContent>
         <w:p>
+          <w:pPr>
+            <w:pStyle w:val="TOC1"/>
+            <w:tabs>
+              <w:tab w:val="right" w:pos="9026" w:leader="dot"/>
+            </w:tabs>
+          </w:pPr>
           <w:r>
             <w:fldChar w:fldCharType="begin" w:dirty="true"/>
             <w:instrText xml:space="preserve">TOC \h \o "1-2"</w:instrText>
             <w:fldChar w:fldCharType="separate"/>
           </w:r>
+          <w:hyperlink w:history="1" w:anchor="_Toc1">
+            <w:r>
+              <w:t xml:space="preserve">Supervisor Meeting Log</w:t>
+            </w:r>
+            <w:r>
+              <w:tab/>
+            </w:r>
+            <w:r>
+              <w:fldChar w:fldCharType="begin" w:dirty="true"/>
+              <w:instrText xml:space="preserve">PAGEREF _Toc1 \h</w:instrText>
+              <w:fldChar w:fldCharType="separate"/>
+              <w:fldChar w:fldCharType="end"/>
+            </w:r>
+          </w:hyperlink>
+        </w:p>
+        <w:p>
+          <w:pPr>
+            <w:pStyle w:val="TOC1"/>
+            <w:tabs>
+              <w:tab w:val="right" w:pos="9026" w:leader="dot"/>
+            </w:tabs>
+          </w:pPr>
+          <w:hyperlink w:history="1" w:anchor="_Toc2">
+            <w:r>
+              <w:t xml:space="preserve">Table of Contents</w:t>
+            </w:r>
+            <w:r>
+              <w:tab/>
+            </w:r>
+            <w:r>
+              <w:fldChar w:fldCharType="begin" w:dirty="true"/>
+              <w:instrText xml:space="preserve">PAGEREF _Toc2 \h</w:instrText>
+              <w:fldChar w:fldCharType="separate"/>
+              <w:fldChar w:fldCharType="end"/>
+            </w:r>
+          </w:hyperlink>
+        </w:p>
+        <w:p>
+          <w:pPr>
+            <w:pStyle w:val="TOC1"/>
+            <w:tabs>
+              <w:tab w:val="right" w:pos="9026" w:leader="dot"/>
+            </w:tabs>
+          </w:pPr>
+          <w:hyperlink w:history="1" w:anchor="_Toc3">
+            <w:r>
+              <w:t xml:space="preserve">1. Introduction</w:t>
+            </w:r>
+            <w:r>
+              <w:tab/>
+            </w:r>
+            <w:r>
+              <w:fldChar w:fldCharType="begin" w:dirty="true"/>
+              <w:instrText xml:space="preserve">PAGEREF _Toc3 \h</w:instrText>
+              <w:fldChar w:fldCharType="separate"/>
+              <w:fldChar w:fldCharType="end"/>
+            </w:r>
+          </w:hyperlink>
+        </w:p>
+        <w:p>
+          <w:pPr>
+            <w:pStyle w:val="TOC1"/>
+            <w:tabs>
+              <w:tab w:val="right" w:pos="9026" w:leader="dot"/>
+            </w:tabs>
+          </w:pPr>
+          <w:hyperlink w:history="1" w:anchor="_Toc4">
+            <w:r>
+              <w:t xml:space="preserve">2. Why the Scope Was Revised</w:t>
+            </w:r>
+            <w:r>
+              <w:tab/>
+            </w:r>
+            <w:r>
+              <w:fldChar w:fldCharType="begin" w:dirty="true"/>
+              <w:instrText xml:space="preserve">PAGEREF _Toc4 \h</w:instrText>
+              <w:fldChar w:fldCharType="separate"/>
+              <w:fldChar w:fldCharType="end"/>
+            </w:r>
+          </w:hyperlink>
+        </w:p>
+        <w:p>
+          <w:pPr>
+            <w:pStyle w:val="TOC1"/>
+            <w:tabs>
+              <w:tab w:val="right" w:pos="9026" w:leader="dot"/>
+            </w:tabs>
+          </w:pPr>
+          <w:hyperlink w:history="1" w:anchor="_Toc5">
+            <w:r>
+              <w:t xml:space="preserve">3. Problem Statement</w:t>
+            </w:r>
+            <w:r>
+              <w:tab/>
+            </w:r>
+            <w:r>
+              <w:fldChar w:fldCharType="begin" w:dirty="true"/>
+              <w:instrText xml:space="preserve">PAGEREF _Toc5 \h</w:instrText>
+              <w:fldChar w:fldCharType="separate"/>
+              <w:fldChar w:fldCharType="end"/>
+            </w:r>
+          </w:hyperlink>
+        </w:p>
+        <w:p>
+          <w:pPr>
+            <w:pStyle w:val="TOC1"/>
+            <w:tabs>
+              <w:tab w:val="right" w:pos="9026" w:leader="dot"/>
+            </w:tabs>
+          </w:pPr>
+          <w:hyperlink w:history="1" w:anchor="_Toc6">
+            <w:r>
+              <w:t xml:space="preserve">4. Thesis Statement and Research Hypotheses</w:t>
+            </w:r>
+            <w:r>
+              <w:tab/>
+            </w:r>
+            <w:r>
+              <w:fldChar w:fldCharType="begin" w:dirty="true"/>
+              <w:instrText xml:space="preserve">PAGEREF _Toc6 \h</w:instrText>
+              <w:fldChar w:fldCharType="separate"/>
+              <w:fldChar w:fldCharType="end"/>
+            </w:r>
+          </w:hyperlink>
+        </w:p>
+        <w:p>
+          <w:pPr>
+            <w:pStyle w:val="TOC2"/>
+            <w:tabs>
+              <w:tab w:val="right" w:pos="9026" w:leader="dot"/>
+            </w:tabs>
+            <w:ind w:left="220"/>
+          </w:pPr>
+          <w:hyperlink w:history="1" w:anchor="_Toc7">
+            <w:r>
+              <w:t xml:space="preserve">4.1 Proposed Thesis Title</w:t>
+            </w:r>
+            <w:r>
+              <w:tab/>
+            </w:r>
+            <w:r>
+              <w:fldChar w:fldCharType="begin" w:dirty="true"/>
+              <w:instrText xml:space="preserve">PAGEREF _Toc7 \h</w:instrText>
+              <w:fldChar w:fldCharType="separate"/>
+              <w:fldChar w:fldCharType="end"/>
+            </w:r>
+          </w:hyperlink>
+        </w:p>
+        <w:p>
+          <w:pPr>
+            <w:pStyle w:val="TOC2"/>
+            <w:tabs>
+              <w:tab w:val="right" w:pos="9026" w:leader="dot"/>
+            </w:tabs>
+            <w:ind w:left="220"/>
+          </w:pPr>
+          <w:hyperlink w:history="1" w:anchor="_Toc8">
+            <w:r>
+              <w:t xml:space="preserve">4.2 Thesis Statement</w:t>
+            </w:r>
+            <w:r>
+              <w:tab/>
+            </w:r>
+            <w:r>
+              <w:fldChar w:fldCharType="begin" w:dirty="true"/>
+              <w:instrText xml:space="preserve">PAGEREF _Toc8 \h</w:instrText>
+              <w:fldChar w:fldCharType="separate"/>
+              <w:fldChar w:fldCharType="end"/>
+            </w:r>
+          </w:hyperlink>
+        </w:p>
+        <w:p>
+          <w:pPr>
+            <w:pStyle w:val="TOC2"/>
+            <w:tabs>
+              <w:tab w:val="right" w:pos="9026" w:leader="dot"/>
+            </w:tabs>
+            <w:ind w:left="220"/>
+          </w:pPr>
+          <w:hyperlink w:history="1" w:anchor="_Toc9">
+            <w:r>
+              <w:t xml:space="preserve">4.3 Hypotheses Tested</w:t>
+            </w:r>
+            <w:r>
+              <w:tab/>
+            </w:r>
+            <w:r>
+              <w:fldChar w:fldCharType="begin" w:dirty="true"/>
+              <w:instrText xml:space="preserve">PAGEREF _Toc9 \h</w:instrText>
+              <w:fldChar w:fldCharType="separate"/>
+              <w:fldChar w:fldCharType="end"/>
+            </w:r>
+          </w:hyperlink>
+        </w:p>
+        <w:p>
+          <w:pPr>
+            <w:pStyle w:val="TOC2"/>
+            <w:tabs>
+              <w:tab w:val="right" w:pos="9026" w:leader="dot"/>
+            </w:tabs>
+            <w:ind w:left="220"/>
+          </w:pPr>
+          <w:hyperlink w:history="1" w:anchor="_Toc10">
+            <w:r>
+              <w:t xml:space="preserve">4.4 Additional Validity Checks</w:t>
+            </w:r>
+            <w:r>
+              <w:tab/>
+            </w:r>
+            <w:r>
+              <w:fldChar w:fldCharType="begin" w:dirty="true"/>
+              <w:instrText xml:space="preserve">PAGEREF _Toc10 \h</w:instrText>
+              <w:fldChar w:fldCharType="separate"/>
+              <w:fldChar w:fldCharType="end"/>
+            </w:r>
+          </w:hyperlink>
+        </w:p>
+        <w:p>
+          <w:pPr>
+            <w:pStyle w:val="TOC2"/>
+            <w:tabs>
+              <w:tab w:val="right" w:pos="9026" w:leader="dot"/>
+            </w:tabs>
+            <w:ind w:left="220"/>
+          </w:pPr>
+          <w:hyperlink w:history="1" w:anchor="_Toc11">
+            <w:r>
+              <w:t xml:space="preserve">4.5 What the Thesis Cannot Claim</w:t>
+            </w:r>
+            <w:r>
+              <w:tab/>
+            </w:r>
+            <w:r>
+              <w:fldChar w:fldCharType="begin" w:dirty="true"/>
+              <w:instrText xml:space="preserve">PAGEREF _Toc11 \h</w:instrText>
+              <w:fldChar w:fldCharType="separate"/>
+              <w:fldChar w:fldCharType="end"/>
+            </w:r>
+          </w:hyperlink>
+        </w:p>
+        <w:p>
+          <w:pPr>
+            <w:pStyle w:val="TOC1"/>
+            <w:tabs>
+              <w:tab w:val="right" w:pos="9026" w:leader="dot"/>
+            </w:tabs>
+          </w:pPr>
+          <w:hyperlink w:history="1" w:anchor="_Toc12">
+            <w:r>
+              <w:t xml:space="preserve">5. Objectives and Success Criteria</w:t>
+            </w:r>
+            <w:r>
+              <w:tab/>
+            </w:r>
+            <w:r>
+              <w:fldChar w:fldCharType="begin" w:dirty="true"/>
+              <w:instrText xml:space="preserve">PAGEREF _Toc12 \h</w:instrText>
+              <w:fldChar w:fldCharType="separate"/>
+              <w:fldChar w:fldCharType="end"/>
+            </w:r>
+          </w:hyperlink>
+        </w:p>
+        <w:p>
+          <w:pPr>
+            <w:pStyle w:val="TOC2"/>
+            <w:tabs>
+              <w:tab w:val="right" w:pos="9026" w:leader="dot"/>
+            </w:tabs>
+            <w:ind w:left="220"/>
+          </w:pPr>
+          <w:hyperlink w:history="1" w:anchor="_Toc13">
+            <w:r>
+              <w:t xml:space="preserve">5.1 Core Objectives (must be achieved)</w:t>
+            </w:r>
+            <w:r>
+              <w:tab/>
+            </w:r>
+            <w:r>
+              <w:fldChar w:fldCharType="begin" w:dirty="true"/>
+              <w:instrText xml:space="preserve">PAGEREF _Toc13 \h</w:instrText>
+              <w:fldChar w:fldCharType="separate"/>
+              <w:fldChar w:fldCharType="end"/>
+            </w:r>
+          </w:hyperlink>
+        </w:p>
+        <w:p>
+          <w:pPr>
+            <w:pStyle w:val="TOC2"/>
+            <w:tabs>
+              <w:tab w:val="right" w:pos="9026" w:leader="dot"/>
+            </w:tabs>
+            <w:ind w:left="220"/>
+          </w:pPr>
+          <w:hyperlink w:history="1" w:anchor="_Toc14">
+            <w:r>
+              <w:t xml:space="preserve">5.2 Optional Objectives (only after the core is complete)</w:t>
+            </w:r>
+            <w:r>
+              <w:tab/>
+            </w:r>
+            <w:r>
+              <w:fldChar w:fldCharType="begin" w:dirty="true"/>
+              <w:instrText xml:space="preserve">PAGEREF _Toc14 \h</w:instrText>
+              <w:fldChar w:fldCharType="separate"/>
+              <w:fldChar w:fldCharType="end"/>
+            </w:r>
+          </w:hyperlink>
+        </w:p>
+        <w:p>
+          <w:pPr>
+            <w:pStyle w:val="TOC2"/>
+            <w:tabs>
+              <w:tab w:val="right" w:pos="9026" w:leader="dot"/>
+            </w:tabs>
+            <w:ind w:left="220"/>
+          </w:pPr>
+          <w:hyperlink w:history="1" w:anchor="_Toc15">
+            <w:r>
+              <w:t xml:space="preserve">5.3 Performance Targets</w:t>
+            </w:r>
+            <w:r>
+              <w:tab/>
+            </w:r>
+            <w:r>
+              <w:fldChar w:fldCharType="begin" w:dirty="true"/>
+              <w:instrText xml:space="preserve">PAGEREF _Toc15 \h</w:instrText>
+              <w:fldChar w:fldCharType="separate"/>
+              <w:fldChar w:fldCharType="end"/>
+            </w:r>
+          </w:hyperlink>
+        </w:p>
+        <w:p>
+          <w:pPr>
+            <w:pStyle w:val="TOC1"/>
+            <w:tabs>
+              <w:tab w:val="right" w:pos="9026" w:leader="dot"/>
+            </w:tabs>
+          </w:pPr>
+          <w:hyperlink w:history="1" w:anchor="_Toc16">
+            <w:r>
+              <w:t xml:space="preserve">6. Scope</w:t>
+            </w:r>
+            <w:r>
+              <w:tab/>
+            </w:r>
+            <w:r>
+              <w:fldChar w:fldCharType="begin" w:dirty="true"/>
+              <w:instrText xml:space="preserve">PAGEREF _Toc16 \h</w:instrText>
+              <w:fldChar w:fldCharType="separate"/>
+              <w:fldChar w:fldCharType="end"/>
+            </w:r>
+          </w:hyperlink>
+        </w:p>
+        <w:p>
+          <w:pPr>
+            <w:pStyle w:val="TOC2"/>
+            <w:tabs>
+              <w:tab w:val="right" w:pos="9026" w:leader="dot"/>
+            </w:tabs>
+            <w:ind w:left="220"/>
+          </w:pPr>
+          <w:hyperlink w:history="1" w:anchor="_Toc17">
+            <w:r>
+              <w:t xml:space="preserve">6.1 In Scope</w:t>
+            </w:r>
+            <w:r>
+              <w:tab/>
+            </w:r>
+            <w:r>
+              <w:fldChar w:fldCharType="begin" w:dirty="true"/>
+              <w:instrText xml:space="preserve">PAGEREF _Toc17 \h</w:instrText>
+              <w:fldChar w:fldCharType="separate"/>
+              <w:fldChar w:fldCharType="end"/>
+            </w:r>
+          </w:hyperlink>
+        </w:p>
+        <w:p>
+          <w:pPr>
+            <w:pStyle w:val="TOC2"/>
+            <w:tabs>
+              <w:tab w:val="right" w:pos="9026" w:leader="dot"/>
+            </w:tabs>
+            <w:ind w:left="220"/>
+          </w:pPr>
+          <w:hyperlink w:history="1" w:anchor="_Toc18">
+            <w:r>
+              <w:t xml:space="preserve">6.2 Out of Scope</w:t>
+            </w:r>
+            <w:r>
+              <w:tab/>
+            </w:r>
+            <w:r>
+              <w:fldChar w:fldCharType="begin" w:dirty="true"/>
+              <w:instrText xml:space="preserve">PAGEREF _Toc18 \h</w:instrText>
+              <w:fldChar w:fldCharType="separate"/>
+              <w:fldChar w:fldCharType="end"/>
+            </w:r>
+          </w:hyperlink>
+        </w:p>
+        <w:p>
+          <w:pPr>
+            <w:pStyle w:val="TOC1"/>
+            <w:tabs>
+              <w:tab w:val="right" w:pos="9026" w:leader="dot"/>
+            </w:tabs>
+          </w:pPr>
+          <w:hyperlink w:history="1" w:anchor="_Toc19">
+            <w:r>
+              <w:t xml:space="preserve">7. Dataset</w:t>
+            </w:r>
+            <w:r>
+              <w:tab/>
+            </w:r>
+            <w:r>
+              <w:fldChar w:fldCharType="begin" w:dirty="true"/>
+              <w:instrText xml:space="preserve">PAGEREF _Toc19 \h</w:instrText>
+              <w:fldChar w:fldCharType="separate"/>
+              <w:fldChar w:fldCharType="end"/>
+            </w:r>
+          </w:hyperlink>
+        </w:p>
+        <w:p>
+          <w:pPr>
+            <w:pStyle w:val="TOC2"/>
+            <w:tabs>
+              <w:tab w:val="right" w:pos="9026" w:leader="dot"/>
+            </w:tabs>
+            <w:ind w:left="220"/>
+          </w:pPr>
+          <w:hyperlink w:history="1" w:anchor="_Toc20">
+            <w:r>
+              <w:t xml:space="preserve">7.1 Source</w:t>
+            </w:r>
+            <w:r>
+              <w:tab/>
+            </w:r>
+            <w:r>
+              <w:fldChar w:fldCharType="begin" w:dirty="true"/>
+              <w:instrText xml:space="preserve">PAGEREF _Toc20 \h</w:instrText>
+              <w:fldChar w:fldCharType="separate"/>
+              <w:fldChar w:fldCharType="end"/>
+            </w:r>
+          </w:hyperlink>
+        </w:p>
+        <w:p>
+          <w:pPr>
+            <w:pStyle w:val="TOC2"/>
+            <w:tabs>
+              <w:tab w:val="right" w:pos="9026" w:leader="dot"/>
+            </w:tabs>
+            <w:ind w:left="220"/>
+          </w:pPr>
+          <w:hyperlink w:history="1" w:anchor="_Toc21">
+            <w:r>
+              <w:t xml:space="preserve">7.2 Known Characteristics (from the October 2026 sample audit)</w:t>
+            </w:r>
+            <w:r>
+              <w:tab/>
+            </w:r>
+            <w:r>
+              <w:fldChar w:fldCharType="begin" w:dirty="true"/>
+              <w:instrText xml:space="preserve">PAGEREF _Toc21 \h</w:instrText>
+              <w:fldChar w:fldCharType="separate"/>
+              <w:fldChar w:fldCharType="end"/>
+            </w:r>
+          </w:hyperlink>
+        </w:p>
+        <w:p>
+          <w:pPr>
+            <w:pStyle w:val="TOC2"/>
+            <w:tabs>
+              <w:tab w:val="right" w:pos="9026" w:leader="dot"/>
+            </w:tabs>
+            <w:ind w:left="220"/>
+          </w:pPr>
+          <w:hyperlink w:history="1" w:anchor="_Toc22">
+            <w:r>
+              <w:t xml:space="preserve">7.3 How the Data Is Used</w:t>
+            </w:r>
+            <w:r>
+              <w:tab/>
+            </w:r>
+            <w:r>
+              <w:fldChar w:fldCharType="begin" w:dirty="true"/>
+              <w:instrText xml:space="preserve">PAGEREF _Toc22 \h</w:instrText>
+              <w:fldChar w:fldCharType="separate"/>
+              <w:fldChar w:fldCharType="end"/>
+            </w:r>
+          </w:hyperlink>
+        </w:p>
+        <w:p>
+          <w:pPr>
+            <w:pStyle w:val="TOC1"/>
+            <w:tabs>
+              <w:tab w:val="right" w:pos="9026" w:leader="dot"/>
+            </w:tabs>
+          </w:pPr>
+          <w:hyperlink w:history="1" w:anchor="_Toc23">
+            <w:r>
+              <w:t xml:space="preserve">8. Related Work</w:t>
+            </w:r>
+            <w:r>
+              <w:tab/>
+            </w:r>
+            <w:r>
+              <w:fldChar w:fldCharType="begin" w:dirty="true"/>
+              <w:instrText xml:space="preserve">PAGEREF _Toc23 \h</w:instrText>
+              <w:fldChar w:fldCharType="separate"/>
+              <w:fldChar w:fldCharType="end"/>
+            </w:r>
+          </w:hyperlink>
+        </w:p>
+        <w:p>
+          <w:pPr>
+            <w:pStyle w:val="TOC1"/>
+            <w:tabs>
+              <w:tab w:val="right" w:pos="9026" w:leader="dot"/>
+            </w:tabs>
+          </w:pPr>
+          <w:hyperlink w:history="1" w:anchor="_Toc24">
+            <w:r>
+              <w:t xml:space="preserve">9. System Overview</w:t>
+            </w:r>
+            <w:r>
+              <w:tab/>
+            </w:r>
+            <w:r>
+              <w:fldChar w:fldCharType="begin" w:dirty="true"/>
+              <w:instrText xml:space="preserve">PAGEREF _Toc24 \h</w:instrText>
+              <w:fldChar w:fldCharType="separate"/>
+              <w:fldChar w:fldCharType="end"/>
+            </w:r>
+          </w:hyperlink>
+        </w:p>
+        <w:p>
+          <w:pPr>
+            <w:pStyle w:val="TOC2"/>
+            <w:tabs>
+              <w:tab w:val="right" w:pos="9026" w:leader="dot"/>
+            </w:tabs>
+            <w:ind w:left="220"/>
+          </w:pPr>
+          <w:hyperlink w:history="1" w:anchor="_Toc25">
+            <w:r>
+              <w:t xml:space="preserve">9.1 Architecture</w:t>
+            </w:r>
+            <w:r>
+              <w:tab/>
+            </w:r>
+            <w:r>
+              <w:fldChar w:fldCharType="begin" w:dirty="true"/>
+              <w:instrText xml:space="preserve">PAGEREF _Toc25 \h</w:instrText>
+              <w:fldChar w:fldCharType="separate"/>
+              <w:fldChar w:fldCharType="end"/>
+            </w:r>
+          </w:hyperlink>
+        </w:p>
+        <w:p>
+          <w:pPr>
+            <w:pStyle w:val="TOC2"/>
+            <w:tabs>
+              <w:tab w:val="right" w:pos="9026" w:leader="dot"/>
+            </w:tabs>
+            <w:ind w:left="220"/>
+          </w:pPr>
+          <w:hyperlink w:history="1" w:anchor="_Toc26">
+            <w:r>
+              <w:t xml:space="preserve">9.2 Doctor's Journey</w:t>
+            </w:r>
+            <w:r>
+              <w:tab/>
+            </w:r>
+            <w:r>
+              <w:fldChar w:fldCharType="begin" w:dirty="true"/>
+              <w:instrText xml:space="preserve">PAGEREF _Toc26 \h</w:instrText>
+              <w:fldChar w:fldCharType="separate"/>
+              <w:fldChar w:fldCharType="end"/>
+            </w:r>
+          </w:hyperlink>
+        </w:p>
+        <w:p>
+          <w:pPr>
+            <w:pStyle w:val="TOC2"/>
+            <w:tabs>
+              <w:tab w:val="right" w:pos="9026" w:leader="dot"/>
+            </w:tabs>
+            <w:ind w:left="220"/>
+          </w:pPr>
+          <w:hyperlink w:history="1" w:anchor="_Toc27">
+            <w:r>
+              <w:t xml:space="preserve">9.3 Roles and Permissions</w:t>
+            </w:r>
+            <w:r>
+              <w:tab/>
+            </w:r>
+            <w:r>
+              <w:fldChar w:fldCharType="begin" w:dirty="true"/>
+              <w:instrText xml:space="preserve">PAGEREF _Toc27 \h</w:instrText>
+              <w:fldChar w:fldCharType="separate"/>
+              <w:fldChar w:fldCharType="end"/>
+            </w:r>
+          </w:hyperlink>
+        </w:p>
+        <w:p>
+          <w:pPr>
+            <w:pStyle w:val="TOC1"/>
+            <w:tabs>
+              <w:tab w:val="right" w:pos="9026" w:leader="dot"/>
+            </w:tabs>
+          </w:pPr>
+          <w:hyperlink w:history="1" w:anchor="_Toc28">
+            <w:r>
+              <w:t xml:space="preserve">10. Functional Requirements by Module</w:t>
+            </w:r>
+            <w:r>
+              <w:tab/>
+            </w:r>
+            <w:r>
+              <w:fldChar w:fldCharType="begin" w:dirty="true"/>
+              <w:instrText xml:space="preserve">PAGEREF _Toc28 \h</w:instrText>
+              <w:fldChar w:fldCharType="separate"/>
+              <w:fldChar w:fldCharType="end"/>
+            </w:r>
+          </w:hyperlink>
+        </w:p>
+        <w:p>
+          <w:pPr>
+            <w:pStyle w:val="TOC2"/>
+            <w:tabs>
+              <w:tab w:val="right" w:pos="9026" w:leader="dot"/>
+            </w:tabs>
+            <w:ind w:left="220"/>
+          </w:pPr>
+          <w:hyperlink w:history="1" w:anchor="_Toc29">
+            <w:r>
+              <w:t xml:space="preserve">M-01: Accounts and Role-Based Access</w:t>
+            </w:r>
+            <w:r>
+              <w:tab/>
+            </w:r>
+            <w:r>
+              <w:fldChar w:fldCharType="begin" w:dirty="true"/>
+              <w:instrText xml:space="preserve">PAGEREF _Toc29 \h</w:instrText>
+              <w:fldChar w:fldCharType="separate"/>
+              <w:fldChar w:fldCharType="end"/>
+            </w:r>
+          </w:hyperlink>
+        </w:p>
+        <w:p>
+          <w:pPr>
+            <w:pStyle w:val="TOC2"/>
+            <w:tabs>
+              <w:tab w:val="right" w:pos="9026" w:leader="dot"/>
+            </w:tabs>
+            <w:ind w:left="220"/>
+          </w:pPr>
+          <w:hyperlink w:history="1" w:anchor="_Toc30">
+            <w:r>
+              <w:t xml:space="preserve">M-02: Doctor Dashboard</w:t>
+            </w:r>
+            <w:r>
+              <w:tab/>
+            </w:r>
+            <w:r>
+              <w:fldChar w:fldCharType="begin" w:dirty="true"/>
+              <w:instrText xml:space="preserve">PAGEREF _Toc30 \h</w:instrText>
+              <w:fldChar w:fldCharType="separate"/>
+              <w:fldChar w:fldCharType="end"/>
+            </w:r>
+          </w:hyperlink>
+        </w:p>
+        <w:p>
+          <w:pPr>
+            <w:pStyle w:val="TOC2"/>
+            <w:tabs>
+              <w:tab w:val="right" w:pos="9026" w:leader="dot"/>
+            </w:tabs>
+            <w:ind w:left="220"/>
+          </w:pPr>
+          <w:hyperlink w:history="1" w:anchor="_Toc31">
+            <w:r>
+              <w:t xml:space="preserve">M-03: Patient Management</w:t>
+            </w:r>
+            <w:r>
+              <w:tab/>
+            </w:r>
+            <w:r>
+              <w:fldChar w:fldCharType="begin" w:dirty="true"/>
+              <w:instrText xml:space="preserve">PAGEREF _Toc31 \h</w:instrText>
+              <w:fldChar w:fldCharType="separate"/>
+              <w:fldChar w:fldCharType="end"/>
+            </w:r>
+          </w:hyperlink>
+        </w:p>
+        <w:p>
+          <w:pPr>
+            <w:pStyle w:val="TOC2"/>
+            <w:tabs>
+              <w:tab w:val="right" w:pos="9026" w:leader="dot"/>
+            </w:tabs>
+            <w:ind w:left="220"/>
+          </w:pPr>
+          <w:hyperlink w:history="1" w:anchor="_Toc32">
+            <w:r>
+              <w:t xml:space="preserve">M-04: CT Scan Upload and De-identification</w:t>
+            </w:r>
+            <w:r>
+              <w:tab/>
+            </w:r>
+            <w:r>
+              <w:fldChar w:fldCharType="begin" w:dirty="true"/>
+              <w:instrText xml:space="preserve">PAGEREF _Toc32 \h</w:instrText>
+              <w:fldChar w:fldCharType="separate"/>
+              <w:fldChar w:fldCharType="end"/>
+            </w:r>
+          </w:hyperlink>
+        </w:p>
+        <w:p>
+          <w:pPr>
+            <w:pStyle w:val="TOC2"/>
+            <w:tabs>
+              <w:tab w:val="right" w:pos="9026" w:leader="dot"/>
+            </w:tabs>
+            <w:ind w:left="220"/>
+          </w:pPr>
+          <w:hyperlink w:history="1" w:anchor="_Toc33">
+            <w:r>
+              <w:t xml:space="preserve">M-05: AI Analysis Pipeline (inference)</w:t>
+            </w:r>
+            <w:r>
+              <w:tab/>
+            </w:r>
+            <w:r>
+              <w:fldChar w:fldCharType="begin" w:dirty="true"/>
+              <w:instrText xml:space="preserve">PAGEREF _Toc33 \h</w:instrText>
+              <w:fldChar w:fldCharType="separate"/>
+              <w:fldChar w:fldCharType="end"/>
+            </w:r>
+          </w:hyperlink>
+        </w:p>
+        <w:p>
+          <w:pPr>
+            <w:pStyle w:val="TOC2"/>
+            <w:tabs>
+              <w:tab w:val="right" w:pos="9026" w:leader="dot"/>
+            </w:tabs>
+            <w:ind w:left="220"/>
+          </w:pPr>
+          <w:hyperlink w:history="1" w:anchor="_Toc34">
+            <w:r>
+              <w:t xml:space="preserve">M-06: Result and Decision Support</w:t>
+            </w:r>
+            <w:r>
+              <w:tab/>
+            </w:r>
+            <w:r>
+              <w:fldChar w:fldCharType="begin" w:dirty="true"/>
+              <w:instrText xml:space="preserve">PAGEREF _Toc34 \h</w:instrText>
+              <w:fldChar w:fldCharType="separate"/>
+              <w:fldChar w:fldCharType="end"/>
+            </w:r>
+          </w:hyperlink>
+        </w:p>
+        <w:p>
+          <w:pPr>
+            <w:pStyle w:val="TOC2"/>
+            <w:tabs>
+              <w:tab w:val="right" w:pos="9026" w:leader="dot"/>
+            </w:tabs>
+            <w:ind w:left="220"/>
+          </w:pPr>
+          <w:hyperlink w:history="1" w:anchor="_Toc35">
+            <w:r>
+              <w:t xml:space="preserve">M-07: Diagnostic PDF Report</w:t>
+            </w:r>
+            <w:r>
+              <w:tab/>
+            </w:r>
+            <w:r>
+              <w:fldChar w:fldCharType="begin" w:dirty="true"/>
+              <w:instrText xml:space="preserve">PAGEREF _Toc35 \h</w:instrText>
+              <w:fldChar w:fldCharType="separate"/>
+              <w:fldChar w:fldCharType="end"/>
+            </w:r>
+          </w:hyperlink>
+        </w:p>
+        <w:p>
+          <w:pPr>
+            <w:pStyle w:val="TOC2"/>
+            <w:tabs>
+              <w:tab w:val="right" w:pos="9026" w:leader="dot"/>
+            </w:tabs>
+            <w:ind w:left="220"/>
+          </w:pPr>
+          <w:hyperlink w:history="1" w:anchor="_Toc36">
+            <w:r>
+              <w:t xml:space="preserve">M-08: Notifications and Case Workflow</w:t>
+            </w:r>
+            <w:r>
+              <w:tab/>
+            </w:r>
+            <w:r>
+              <w:fldChar w:fldCharType="begin" w:dirty="true"/>
+              <w:instrText xml:space="preserve">PAGEREF _Toc36 \h</w:instrText>
+              <w:fldChar w:fldCharType="separate"/>
+              <w:fldChar w:fldCharType="end"/>
+            </w:r>
+          </w:hyperlink>
+        </w:p>
+        <w:p>
+          <w:pPr>
+            <w:pStyle w:val="TOC2"/>
+            <w:tabs>
+              <w:tab w:val="right" w:pos="9026" w:leader="dot"/>
+            </w:tabs>
+            <w:ind w:left="220"/>
+          </w:pPr>
+          <w:hyperlink w:history="1" w:anchor="_Toc37">
+            <w:r>
+              <w:t xml:space="preserve">M-09: Administration and Audit Log</w:t>
+            </w:r>
+            <w:r>
+              <w:tab/>
+            </w:r>
+            <w:r>
+              <w:fldChar w:fldCharType="begin" w:dirty="true"/>
+              <w:instrText xml:space="preserve">PAGEREF _Toc37 \h</w:instrText>
+              <w:fldChar w:fldCharType="separate"/>
+              <w:fldChar w:fldCharType="end"/>
+            </w:r>
+          </w:hyperlink>
+        </w:p>
+        <w:p>
+          <w:pPr>
+            <w:pStyle w:val="TOC2"/>
+            <w:tabs>
+              <w:tab w:val="right" w:pos="9026" w:leader="dot"/>
+            </w:tabs>
+            <w:ind w:left="220"/>
+          </w:pPr>
+          <w:hyperlink w:history="1" w:anchor="_Toc38">
+            <w:r>
+              <w:t xml:space="preserve">M-10: Model Training and Evaluation Toolkit (offline)</w:t>
+            </w:r>
+            <w:r>
+              <w:tab/>
+            </w:r>
+            <w:r>
+              <w:fldChar w:fldCharType="begin" w:dirty="true"/>
+              <w:instrText xml:space="preserve">PAGEREF _Toc38 \h</w:instrText>
+              <w:fldChar w:fldCharType="separate"/>
+              <w:fldChar w:fldCharType="end"/>
+            </w:r>
+          </w:hyperlink>
+        </w:p>
+        <w:p>
+          <w:pPr>
+            <w:pStyle w:val="TOC2"/>
+            <w:tabs>
+              <w:tab w:val="right" w:pos="9026" w:leader="dot"/>
+            </w:tabs>
+            <w:ind w:left="220"/>
+          </w:pPr>
+          <w:hyperlink w:history="1" w:anchor="_Toc39">
+            <w:r>
+              <w:t xml:space="preserve">M-11 (optional): Heatmap Explanation</w:t>
+            </w:r>
+            <w:r>
+              <w:tab/>
+            </w:r>
+            <w:r>
+              <w:fldChar w:fldCharType="begin" w:dirty="true"/>
+              <w:instrText xml:space="preserve">PAGEREF _Toc39 \h</w:instrText>
+              <w:fldChar w:fldCharType="separate"/>
+              <w:fldChar w:fldCharType="end"/>
+            </w:r>
+          </w:hyperlink>
+        </w:p>
+        <w:p>
+          <w:pPr>
+            <w:pStyle w:val="TOC2"/>
+            <w:tabs>
+              <w:tab w:val="right" w:pos="9026" w:leader="dot"/>
+            </w:tabs>
+            <w:ind w:left="220"/>
+          </w:pPr>
+          <w:hyperlink w:history="1" w:anchor="_Toc40">
+            <w:r>
+              <w:t xml:space="preserve">M-12 (optional): Symptom-Assisted Prediction</w:t>
+            </w:r>
+            <w:r>
+              <w:tab/>
+            </w:r>
+            <w:r>
+              <w:fldChar w:fldCharType="begin" w:dirty="true"/>
+              <w:instrText xml:space="preserve">PAGEREF _Toc40 \h</w:instrText>
+              <w:fldChar w:fldCharType="separate"/>
+              <w:fldChar w:fldCharType="end"/>
+            </w:r>
+          </w:hyperlink>
+        </w:p>
+        <w:p>
+          <w:pPr>
+            <w:pStyle w:val="TOC1"/>
+            <w:tabs>
+              <w:tab w:val="right" w:pos="9026" w:leader="dot"/>
+            </w:tabs>
+          </w:pPr>
+          <w:hyperlink w:history="1" w:anchor="_Toc41">
+            <w:r>
+              <w:t xml:space="preserve">11. AI Model Specification</w:t>
+            </w:r>
+            <w:r>
+              <w:tab/>
+            </w:r>
+            <w:r>
+              <w:fldChar w:fldCharType="begin" w:dirty="true"/>
+              <w:instrText xml:space="preserve">PAGEREF _Toc41 \h</w:instrText>
+              <w:fldChar w:fldCharType="separate"/>
+              <w:fldChar w:fldCharType="end"/>
+            </w:r>
+          </w:hyperlink>
+        </w:p>
+        <w:p>
+          <w:pPr>
+            <w:pStyle w:val="TOC2"/>
+            <w:tabs>
+              <w:tab w:val="right" w:pos="9026" w:leader="dot"/>
+            </w:tabs>
+            <w:ind w:left="220"/>
+          </w:pPr>
+          <w:hyperlink w:history="1" w:anchor="_Toc42">
+            <w:r>
+              <w:t xml:space="preserve">11.1 Preprocessing (identical in training and in the app)</w:t>
+            </w:r>
+            <w:r>
+              <w:tab/>
+            </w:r>
+            <w:r>
+              <w:fldChar w:fldCharType="begin" w:dirty="true"/>
+              <w:instrText xml:space="preserve">PAGEREF _Toc42 \h</w:instrText>
+              <w:fldChar w:fldCharType="separate"/>
+              <w:fldChar w:fldCharType="end"/>
+            </w:r>
+          </w:hyperlink>
+        </w:p>
+        <w:p>
+          <w:pPr>
+            <w:pStyle w:val="TOC2"/>
+            <w:tabs>
+              <w:tab w:val="right" w:pos="9026" w:leader="dot"/>
+            </w:tabs>
+            <w:ind w:left="220"/>
+          </w:pPr>
+          <w:hyperlink w:history="1" w:anchor="_Toc43">
+            <w:r>
+              <w:t xml:space="preserve">11.2 Model</w:t>
+            </w:r>
+            <w:r>
+              <w:tab/>
+            </w:r>
+            <w:r>
+              <w:fldChar w:fldCharType="begin" w:dirty="true"/>
+              <w:instrText xml:space="preserve">PAGEREF _Toc43 \h</w:instrText>
+              <w:fldChar w:fldCharType="separate"/>
+              <w:fldChar w:fldCharType="end"/>
+            </w:r>
+          </w:hyperlink>
+        </w:p>
+        <w:p>
+          <w:pPr>
+            <w:pStyle w:val="TOC2"/>
+            <w:tabs>
+              <w:tab w:val="right" w:pos="9026" w:leader="dot"/>
+            </w:tabs>
+            <w:ind w:left="220"/>
+          </w:pPr>
+          <w:hyperlink w:history="1" w:anchor="_Toc44">
+            <w:r>
+              <w:t xml:space="preserve">11.3 Data Split</w:t>
+            </w:r>
+            <w:r>
+              <w:tab/>
+            </w:r>
+            <w:r>
+              <w:fldChar w:fldCharType="begin" w:dirty="true"/>
+              <w:instrText xml:space="preserve">PAGEREF _Toc44 \h</w:instrText>
+              <w:fldChar w:fldCharType="separate"/>
+              <w:fldChar w:fldCharType="end"/>
+            </w:r>
+          </w:hyperlink>
+        </w:p>
+        <w:p>
+          <w:pPr>
+            <w:pStyle w:val="TOC2"/>
+            <w:tabs>
+              <w:tab w:val="right" w:pos="9026" w:leader="dot"/>
+            </w:tabs>
+            <w:ind w:left="220"/>
+          </w:pPr>
+          <w:hyperlink w:history="1" w:anchor="_Toc45">
+            <w:r>
+              <w:t xml:space="preserve">11.4 Training</w:t>
+            </w:r>
+            <w:r>
+              <w:tab/>
+            </w:r>
+            <w:r>
+              <w:fldChar w:fldCharType="begin" w:dirty="true"/>
+              <w:instrText xml:space="preserve">PAGEREF _Toc45 \h</w:instrText>
+              <w:fldChar w:fldCharType="separate"/>
+              <w:fldChar w:fldCharType="end"/>
+            </w:r>
+          </w:hyperlink>
+        </w:p>
+        <w:p>
+          <w:pPr>
+            <w:pStyle w:val="TOC2"/>
+            <w:tabs>
+              <w:tab w:val="right" w:pos="9026" w:leader="dot"/>
+            </w:tabs>
+            <w:ind w:left="220"/>
+          </w:pPr>
+          <w:hyperlink w:history="1" w:anchor="_Toc46">
+            <w:r>
+              <w:t xml:space="preserve">11.5 Calibration, Prediction and Confidence</w:t>
+            </w:r>
+            <w:r>
+              <w:tab/>
+            </w:r>
+            <w:r>
+              <w:fldChar w:fldCharType="begin" w:dirty="true"/>
+              <w:instrText xml:space="preserve">PAGEREF _Toc46 \h</w:instrText>
+              <w:fldChar w:fldCharType="separate"/>
+              <w:fldChar w:fldCharType="end"/>
+            </w:r>
+          </w:hyperlink>
+        </w:p>
+        <w:p>
+          <w:pPr>
+            <w:pStyle w:val="TOC2"/>
+            <w:tabs>
+              <w:tab w:val="right" w:pos="9026" w:leader="dot"/>
+            </w:tabs>
+            <w:ind w:left="220"/>
+          </w:pPr>
+          <w:hyperlink w:history="1" w:anchor="_Toc47">
+            <w:r>
+              <w:t xml:space="preserve">11.6 Model File (.pth bundle)</w:t>
+            </w:r>
+            <w:r>
+              <w:tab/>
+            </w:r>
+            <w:r>
+              <w:fldChar w:fldCharType="begin" w:dirty="true"/>
+              <w:instrText xml:space="preserve">PAGEREF _Toc47 \h</w:instrText>
+              <w:fldChar w:fldCharType="separate"/>
+              <w:fldChar w:fldCharType="end"/>
+            </w:r>
+          </w:hyperlink>
+        </w:p>
+        <w:p>
+          <w:pPr>
+            <w:pStyle w:val="TOC2"/>
+            <w:tabs>
+              <w:tab w:val="right" w:pos="9026" w:leader="dot"/>
+            </w:tabs>
+            <w:ind w:left="220"/>
+          </w:pPr>
+          <w:hyperlink w:history="1" w:anchor="_Toc48">
+            <w:r>
+              <w:t xml:space="preserve">11.7 Evaluation</w:t>
+            </w:r>
+            <w:r>
+              <w:tab/>
+            </w:r>
+            <w:r>
+              <w:fldChar w:fldCharType="begin" w:dirty="true"/>
+              <w:instrText xml:space="preserve">PAGEREF _Toc48 \h</w:instrText>
+              <w:fldChar w:fldCharType="separate"/>
+              <w:fldChar w:fldCharType="end"/>
+            </w:r>
+          </w:hyperlink>
+        </w:p>
+        <w:p>
+          <w:pPr>
+            <w:pStyle w:val="TOC2"/>
+            <w:tabs>
+              <w:tab w:val="right" w:pos="9026" w:leader="dot"/>
+            </w:tabs>
+            <w:ind w:left="220"/>
+          </w:pPr>
+          <w:hyperlink w:history="1" w:anchor="_Toc49">
+            <w:r>
+              <w:t xml:space="preserve">11.8 Inference Performance</w:t>
+            </w:r>
+            <w:r>
+              <w:tab/>
+            </w:r>
+            <w:r>
+              <w:fldChar w:fldCharType="begin" w:dirty="true"/>
+              <w:instrText xml:space="preserve">PAGEREF _Toc49 \h</w:instrText>
+              <w:fldChar w:fldCharType="separate"/>
+              <w:fldChar w:fldCharType="end"/>
+            </w:r>
+          </w:hyperlink>
+        </w:p>
+        <w:p>
+          <w:pPr>
+            <w:pStyle w:val="TOC1"/>
+            <w:tabs>
+              <w:tab w:val="right" w:pos="9026" w:leader="dot"/>
+            </w:tabs>
+          </w:pPr>
+          <w:hyperlink w:history="1" w:anchor="_Toc50">
+            <w:r>
+              <w:t xml:space="preserve">12. Non-Functional Requirements</w:t>
+            </w:r>
+            <w:r>
+              <w:tab/>
+            </w:r>
+            <w:r>
+              <w:fldChar w:fldCharType="begin" w:dirty="true"/>
+              <w:instrText xml:space="preserve">PAGEREF _Toc50 \h</w:instrText>
+              <w:fldChar w:fldCharType="separate"/>
+              <w:fldChar w:fldCharType="end"/>
+            </w:r>
+          </w:hyperlink>
+        </w:p>
+        <w:p>
+          <w:pPr>
+            <w:pStyle w:val="TOC1"/>
+            <w:tabs>
+              <w:tab w:val="right" w:pos="9026" w:leader="dot"/>
+            </w:tabs>
+          </w:pPr>
+          <w:hyperlink w:history="1" w:anchor="_Toc51">
+            <w:r>
+              <w:t xml:space="preserve">13. Technology Stack</w:t>
+            </w:r>
+            <w:r>
+              <w:tab/>
+            </w:r>
+            <w:r>
+              <w:fldChar w:fldCharType="begin" w:dirty="true"/>
+              <w:instrText xml:space="preserve">PAGEREF _Toc51 \h</w:instrText>
+              <w:fldChar w:fldCharType="separate"/>
+              <w:fldChar w:fldCharType="end"/>
+            </w:r>
+          </w:hyperlink>
+        </w:p>
+        <w:p>
+          <w:pPr>
+            <w:pStyle w:val="TOC1"/>
+            <w:tabs>
+              <w:tab w:val="right" w:pos="9026" w:leader="dot"/>
+            </w:tabs>
+          </w:pPr>
+          <w:hyperlink w:history="1" w:anchor="_Toc52">
+            <w:r>
+              <w:t xml:space="preserve">14. Repository Structure and Git Workflow</w:t>
+            </w:r>
+            <w:r>
+              <w:tab/>
+            </w:r>
+            <w:r>
+              <w:fldChar w:fldCharType="begin" w:dirty="true"/>
+              <w:instrText xml:space="preserve">PAGEREF _Toc52 \h</w:instrText>
+              <w:fldChar w:fldCharType="separate"/>
+              <w:fldChar w:fldCharType="end"/>
+            </w:r>
+          </w:hyperlink>
+        </w:p>
+        <w:p>
+          <w:pPr>
+            <w:pStyle w:val="TOC2"/>
+            <w:tabs>
+              <w:tab w:val="right" w:pos="9026" w:leader="dot"/>
+            </w:tabs>
+            <w:ind w:left="220"/>
+          </w:pPr>
+          <w:hyperlink w:history="1" w:anchor="_Toc53">
+            <w:r>
+              <w:t xml:space="preserve">14.1 Repository Layout (github.com/ahmadraza225/CaviNet_V1)</w:t>
+            </w:r>
+            <w:r>
+              <w:tab/>
+            </w:r>
+            <w:r>
+              <w:fldChar w:fldCharType="begin" w:dirty="true"/>
+              <w:instrText xml:space="preserve">PAGEREF _Toc53 \h</w:instrText>
+              <w:fldChar w:fldCharType="separate"/>
+              <w:fldChar w:fldCharType="end"/>
+            </w:r>
+          </w:hyperlink>
+        </w:p>
+        <w:p>
+          <w:pPr>
+            <w:pStyle w:val="TOC2"/>
+            <w:tabs>
+              <w:tab w:val="right" w:pos="9026" w:leader="dot"/>
+            </w:tabs>
+            <w:ind w:left="220"/>
+          </w:pPr>
+          <w:hyperlink w:history="1" w:anchor="_Toc54">
+            <w:r>
+              <w:t xml:space="preserve">14.2 Workflow for Every Phase</w:t>
+            </w:r>
+            <w:r>
+              <w:tab/>
+            </w:r>
+            <w:r>
+              <w:fldChar w:fldCharType="begin" w:dirty="true"/>
+              <w:instrText xml:space="preserve">PAGEREF _Toc54 \h</w:instrText>
+              <w:fldChar w:fldCharType="separate"/>
+              <w:fldChar w:fldCharType="end"/>
+            </w:r>
+          </w:hyperlink>
+        </w:p>
+        <w:p>
+          <w:pPr>
+            <w:pStyle w:val="TOC2"/>
+            <w:tabs>
+              <w:tab w:val="right" w:pos="9026" w:leader="dot"/>
+            </w:tabs>
+            <w:ind w:left="220"/>
+          </w:pPr>
+          <w:hyperlink w:history="1" w:anchor="_Toc55">
+            <w:r>
+              <w:t xml:space="preserve">14.3 Definition of Done (applies to every phase)</w:t>
+            </w:r>
+            <w:r>
+              <w:tab/>
+            </w:r>
+            <w:r>
+              <w:fldChar w:fldCharType="begin" w:dirty="true"/>
+              <w:instrText xml:space="preserve">PAGEREF _Toc55 \h</w:instrText>
+              <w:fldChar w:fldCharType="separate"/>
+              <w:fldChar w:fldCharType="end"/>
+            </w:r>
+          </w:hyperlink>
+        </w:p>
+        <w:p>
+          <w:pPr>
+            <w:pStyle w:val="TOC1"/>
+            <w:tabs>
+              <w:tab w:val="right" w:pos="9026" w:leader="dot"/>
+            </w:tabs>
+          </w:pPr>
+          <w:hyperlink w:history="1" w:anchor="_Toc56">
+            <w:r>
+              <w:t xml:space="preserve">15. Implementation Phases</w:t>
+            </w:r>
+            <w:r>
+              <w:tab/>
+            </w:r>
+            <w:r>
+              <w:fldChar w:fldCharType="begin" w:dirty="true"/>
+              <w:instrText xml:space="preserve">PAGEREF _Toc56 \h</w:instrText>
+              <w:fldChar w:fldCharType="separate"/>
+              <w:fldChar w:fldCharType="end"/>
+            </w:r>
+          </w:hyperlink>
+        </w:p>
+        <w:p>
+          <w:pPr>
+            <w:pStyle w:val="TOC2"/>
+            <w:tabs>
+              <w:tab w:val="right" w:pos="9026" w:leader="dot"/>
+            </w:tabs>
+            <w:ind w:left="220"/>
+          </w:pPr>
+          <w:hyperlink w:history="1" w:anchor="_Toc57">
+            <w:r>
+              <w:t xml:space="preserve">15.0 How to Use This Section</w:t>
+            </w:r>
+            <w:r>
+              <w:tab/>
+            </w:r>
+            <w:r>
+              <w:fldChar w:fldCharType="begin" w:dirty="true"/>
+              <w:instrText xml:space="preserve">PAGEREF _Toc57 \h</w:instrText>
+              <w:fldChar w:fldCharType="separate"/>
+              <w:fldChar w:fldCharType="end"/>
+            </w:r>
+          </w:hyperlink>
+        </w:p>
+        <w:p>
+          <w:pPr>
+            <w:pStyle w:val="TOC2"/>
+            <w:tabs>
+              <w:tab w:val="right" w:pos="9026" w:leader="dot"/>
+            </w:tabs>
+            <w:ind w:left="220"/>
+          </w:pPr>
+          <w:hyperlink w:history="1" w:anchor="_Toc58">
+            <w:r>
+              <w:t xml:space="preserve">15.1 Phase Overview</w:t>
+            </w:r>
+            <w:r>
+              <w:tab/>
+            </w:r>
+            <w:r>
+              <w:fldChar w:fldCharType="begin" w:dirty="true"/>
+              <w:instrText xml:space="preserve">PAGEREF _Toc58 \h</w:instrText>
+              <w:fldChar w:fldCharType="separate"/>
+              <w:fldChar w:fldCharType="end"/>
+            </w:r>
+          </w:hyperlink>
+        </w:p>
+        <w:p>
+          <w:pPr>
+            <w:pStyle w:val="TOC2"/>
+            <w:tabs>
+              <w:tab w:val="right" w:pos="9026" w:leader="dot"/>
+            </w:tabs>
+            <w:ind w:left="220"/>
+          </w:pPr>
+          <w:hyperlink w:history="1" w:anchor="_Toc59">
+            <w:r>
+              <w:t xml:space="preserve">15.2 Phase 1: Foundation and repository setup</w:t>
+            </w:r>
+            <w:r>
+              <w:tab/>
+            </w:r>
+            <w:r>
+              <w:fldChar w:fldCharType="begin" w:dirty="true"/>
+              <w:instrText xml:space="preserve">PAGEREF _Toc59 \h</w:instrText>
+              <w:fldChar w:fldCharType="separate"/>
+              <w:fldChar w:fldCharType="end"/>
+            </w:r>
+          </w:hyperlink>
+        </w:p>
+        <w:p>
+          <w:pPr>
+            <w:pStyle w:val="TOC2"/>
+            <w:tabs>
+              <w:tab w:val="right" w:pos="9026" w:leader="dot"/>
+            </w:tabs>
+            <w:ind w:left="220"/>
+          </w:pPr>
+          <w:hyperlink w:history="1" w:anchor="_Toc60">
+            <w:r>
+              <w:t xml:space="preserve">15.3 Phase 2: Accounts, roles and administration</w:t>
+            </w:r>
+            <w:r>
+              <w:tab/>
+            </w:r>
+            <w:r>
+              <w:fldChar w:fldCharType="begin" w:dirty="true"/>
+              <w:instrText xml:space="preserve">PAGEREF _Toc60 \h</w:instrText>
+              <w:fldChar w:fldCharType="separate"/>
+              <w:fldChar w:fldCharType="end"/>
+            </w:r>
+          </w:hyperlink>
+        </w:p>
+        <w:p>
+          <w:pPr>
+            <w:pStyle w:val="TOC2"/>
+            <w:tabs>
+              <w:tab w:val="right" w:pos="9026" w:leader="dot"/>
+            </w:tabs>
+            <w:ind w:left="220"/>
+          </w:pPr>
+          <w:hyperlink w:history="1" w:anchor="_Toc61">
+            <w:r>
+              <w:t xml:space="preserve">15.4 Phase 3: Patients and doctor dashboard</w:t>
+            </w:r>
+            <w:r>
+              <w:tab/>
+            </w:r>
+            <w:r>
+              <w:fldChar w:fldCharType="begin" w:dirty="true"/>
+              <w:instrText xml:space="preserve">PAGEREF _Toc61 \h</w:instrText>
+              <w:fldChar w:fldCharType="separate"/>
+              <w:fldChar w:fldCharType="end"/>
+            </w:r>
+          </w:hyperlink>
+        </w:p>
+        <w:p>
+          <w:pPr>
+            <w:pStyle w:val="TOC2"/>
+            <w:tabs>
+              <w:tab w:val="right" w:pos="9026" w:leader="dot"/>
+            </w:tabs>
+            <w:ind w:left="220"/>
+          </w:pPr>
+          <w:hyperlink w:history="1" w:anchor="_Toc62">
+            <w:r>
+              <w:t xml:space="preserve">15.5 Phase 4: CT upload, de-identification and case workflow</w:t>
+            </w:r>
+            <w:r>
+              <w:tab/>
+            </w:r>
+            <w:r>
+              <w:fldChar w:fldCharType="begin" w:dirty="true"/>
+              <w:instrText xml:space="preserve">PAGEREF _Toc62 \h</w:instrText>
+              <w:fldChar w:fldCharType="separate"/>
+              <w:fldChar w:fldCharType="end"/>
+            </w:r>
+          </w:hyperlink>
+        </w:p>
+        <w:p>
+          <w:pPr>
+            <w:pStyle w:val="TOC2"/>
+            <w:tabs>
+              <w:tab w:val="right" w:pos="9026" w:leader="dot"/>
+            </w:tabs>
+            <w:ind w:left="220"/>
+          </w:pPr>
+          <w:hyperlink w:history="1" w:anchor="_Toc63">
+            <w:r>
+              <w:t xml:space="preserve">15.6 Phase 5: AI inference engine and results</w:t>
+            </w:r>
+            <w:r>
+              <w:tab/>
+            </w:r>
+            <w:r>
+              <w:fldChar w:fldCharType="begin" w:dirty="true"/>
+              <w:instrText xml:space="preserve">PAGEREF _Toc63 \h</w:instrText>
+              <w:fldChar w:fldCharType="separate"/>
+              <w:fldChar w:fldCharType="end"/>
+            </w:r>
+          </w:hyperlink>
+        </w:p>
+        <w:p>
+          <w:pPr>
+            <w:pStyle w:val="TOC2"/>
+            <w:tabs>
+              <w:tab w:val="right" w:pos="9026" w:leader="dot"/>
+            </w:tabs>
+            <w:ind w:left="220"/>
+          </w:pPr>
+          <w:hyperlink w:history="1" w:anchor="_Toc64">
+            <w:r>
+              <w:t xml:space="preserve">15.7 Phase 6: Training and evaluation toolkit</w:t>
+            </w:r>
+            <w:r>
+              <w:tab/>
+            </w:r>
+            <w:r>
+              <w:fldChar w:fldCharType="begin" w:dirty="true"/>
+              <w:instrText xml:space="preserve">PAGEREF _Toc64 \h</w:instrText>
+              <w:fldChar w:fldCharType="separate"/>
+              <w:fldChar w:fldCharType="end"/>
+            </w:r>
+          </w:hyperlink>
+        </w:p>
+        <w:p>
+          <w:pPr>
+            <w:pStyle w:val="TOC2"/>
+            <w:tabs>
+              <w:tab w:val="right" w:pos="9026" w:leader="dot"/>
+            </w:tabs>
+            <w:ind w:left="220"/>
+          </w:pPr>
+          <w:hyperlink w:history="1" w:anchor="_Toc65">
+            <w:r>
+              <w:t xml:space="preserve">15.8 Phase 7: Reports, end-to-end testing and documentation</w:t>
+            </w:r>
+            <w:r>
+              <w:tab/>
+            </w:r>
+            <w:r>
+              <w:fldChar w:fldCharType="begin" w:dirty="true"/>
+              <w:instrText xml:space="preserve">PAGEREF _Toc65 \h</w:instrText>
+              <w:fldChar w:fldCharType="separate"/>
+              <w:fldChar w:fldCharType="end"/>
+            </w:r>
+          </w:hyperlink>
+        </w:p>
+        <w:p>
+          <w:pPr>
+            <w:pStyle w:val="TOC2"/>
+            <w:tabs>
+              <w:tab w:val="right" w:pos="9026" w:leader="dot"/>
+            </w:tabs>
+            <w:ind w:left="220"/>
+          </w:pPr>
+          <w:hyperlink w:history="1" w:anchor="_Toc66">
+            <w:r>
+              <w:t xml:space="preserve">15.9 Phase 8: Dataset processing and model training (GPU computer)</w:t>
+            </w:r>
+            <w:r>
+              <w:tab/>
+            </w:r>
+            <w:r>
+              <w:fldChar w:fldCharType="begin" w:dirty="true"/>
+              <w:instrText xml:space="preserve">PAGEREF _Toc66 \h</w:instrText>
+              <w:fldChar w:fldCharType="separate"/>
+              <w:fldChar w:fldCharType="end"/>
+            </w:r>
+          </w:hyperlink>
+        </w:p>
+        <w:p>
+          <w:pPr>
+            <w:pStyle w:val="TOC2"/>
+            <w:tabs>
+              <w:tab w:val="right" w:pos="9026" w:leader="dot"/>
+            </w:tabs>
+            <w:ind w:left="220"/>
+          </w:pPr>
+          <w:hyperlink w:history="1" w:anchor="_Toc67">
+            <w:r>
+              <w:t xml:space="preserve">15.10 Phase 9: Real-model integration and final evaluation</w:t>
+            </w:r>
+            <w:r>
+              <w:tab/>
+            </w:r>
+            <w:r>
+              <w:fldChar w:fldCharType="begin" w:dirty="true"/>
+              <w:instrText xml:space="preserve">PAGEREF _Toc67 \h</w:instrText>
+              <w:fldChar w:fldCharType="separate"/>
+              <w:fldChar w:fldCharType="end"/>
+            </w:r>
+          </w:hyperlink>
+        </w:p>
+        <w:p>
+          <w:pPr>
+            <w:pStyle w:val="TOC2"/>
+            <w:tabs>
+              <w:tab w:val="right" w:pos="9026" w:leader="dot"/>
+            </w:tabs>
+            <w:ind w:left="220"/>
+          </w:pPr>
+          <w:hyperlink w:history="1" w:anchor="_Toc68">
+            <w:r>
+              <w:t xml:space="preserve">15.11 Phase 10: Heatmap explanation (optional)</w:t>
+            </w:r>
+            <w:r>
+              <w:tab/>
+            </w:r>
+            <w:r>
+              <w:fldChar w:fldCharType="begin" w:dirty="true"/>
+              <w:instrText xml:space="preserve">PAGEREF _Toc68 \h</w:instrText>
+              <w:fldChar w:fldCharType="separate"/>
+              <w:fldChar w:fldCharType="end"/>
+            </w:r>
+          </w:hyperlink>
+        </w:p>
+        <w:p>
+          <w:pPr>
+            <w:pStyle w:val="TOC2"/>
+            <w:tabs>
+              <w:tab w:val="right" w:pos="9026" w:leader="dot"/>
+            </w:tabs>
+            <w:ind w:left="220"/>
+          </w:pPr>
+          <w:hyperlink w:history="1" w:anchor="_Toc69">
+            <w:r>
+              <w:t xml:space="preserve">15.12 Phase 11: Symptom-assisted prediction (optional)</w:t>
+            </w:r>
+            <w:r>
+              <w:tab/>
+            </w:r>
+            <w:r>
+              <w:fldChar w:fldCharType="begin" w:dirty="true"/>
+              <w:instrText xml:space="preserve">PAGEREF _Toc69 \h</w:instrText>
+              <w:fldChar w:fldCharType="separate"/>
+              <w:fldChar w:fldCharType="end"/>
+            </w:r>
+          </w:hyperlink>
+        </w:p>
+        <w:p>
+          <w:pPr>
+            <w:pStyle w:val="TOC2"/>
+            <w:tabs>
+              <w:tab w:val="right" w:pos="9026" w:leader="dot"/>
+            </w:tabs>
+            <w:ind w:left="220"/>
+          </w:pPr>
+          <w:hyperlink w:history="1" w:anchor="_Toc70">
+            <w:r>
+              <w:t xml:space="preserve">15.13 Phase 12: Final release and thesis package</w:t>
+            </w:r>
+            <w:r>
+              <w:tab/>
+            </w:r>
+            <w:r>
+              <w:fldChar w:fldCharType="begin" w:dirty="true"/>
+              <w:instrText xml:space="preserve">PAGEREF _Toc70 \h</w:instrText>
+              <w:fldChar w:fldCharType="separate"/>
+              <w:fldChar w:fldCharType="end"/>
+            </w:r>
+          </w:hyperlink>
+        </w:p>
+        <w:p>
+          <w:pPr>
+            <w:pStyle w:val="TOC1"/>
+            <w:tabs>
+              <w:tab w:val="right" w:pos="9026" w:leader="dot"/>
+            </w:tabs>
+          </w:pPr>
+          <w:hyperlink w:history="1" w:anchor="_Toc71">
+            <w:r>
+              <w:t xml:space="preserve">16. Team Roles and Responsibilities</w:t>
+            </w:r>
+            <w:r>
+              <w:tab/>
+            </w:r>
+            <w:r>
+              <w:fldChar w:fldCharType="begin" w:dirty="true"/>
+              <w:instrText xml:space="preserve">PAGEREF _Toc71 \h</w:instrText>
+              <w:fldChar w:fldCharType="separate"/>
+              <w:fldChar w:fldCharType="end"/>
+            </w:r>
+          </w:hyperlink>
+        </w:p>
+        <w:p>
+          <w:pPr>
+            <w:pStyle w:val="TOC1"/>
+            <w:tabs>
+              <w:tab w:val="right" w:pos="9026" w:leader="dot"/>
+            </w:tabs>
+          </w:pPr>
+          <w:hyperlink w:history="1" w:anchor="_Toc72">
+            <w:r>
+              <w:t xml:space="preserve">17. Hardware, Software and Accounts Required</w:t>
+            </w:r>
+            <w:r>
+              <w:tab/>
+            </w:r>
+            <w:r>
+              <w:fldChar w:fldCharType="begin" w:dirty="true"/>
+              <w:instrText xml:space="preserve">PAGEREF _Toc72 \h</w:instrText>
+              <w:fldChar w:fldCharType="separate"/>
+              <w:fldChar w:fldCharType="end"/>
+            </w:r>
+          </w:hyperlink>
+        </w:p>
+        <w:p>
+          <w:pPr>
+            <w:pStyle w:val="TOC1"/>
+            <w:tabs>
+              <w:tab w:val="right" w:pos="9026" w:leader="dot"/>
+            </w:tabs>
+          </w:pPr>
+          <w:hyperlink w:history="1" w:anchor="_Toc73">
+            <w:r>
+              <w:t xml:space="preserve">18. Risks and Mitigations</w:t>
+            </w:r>
+            <w:r>
+              <w:tab/>
+            </w:r>
+            <w:r>
+              <w:fldChar w:fldCharType="begin" w:dirty="true"/>
+              <w:instrText xml:space="preserve">PAGEREF _Toc73 \h</w:instrText>
+              <w:fldChar w:fldCharType="separate"/>
+              <w:fldChar w:fldCharType="end"/>
+            </w:r>
+          </w:hyperlink>
+        </w:p>
+        <w:p>
+          <w:pPr>
+            <w:pStyle w:val="TOC1"/>
+            <w:tabs>
+              <w:tab w:val="right" w:pos="9026" w:leader="dot"/>
+            </w:tabs>
+          </w:pPr>
+          <w:hyperlink w:history="1" w:anchor="_Toc74">
+            <w:r>
+              <w:t xml:space="preserve">19. Limitations</w:t>
+            </w:r>
+            <w:r>
+              <w:tab/>
+            </w:r>
+            <w:r>
+              <w:fldChar w:fldCharType="begin" w:dirty="true"/>
+              <w:instrText xml:space="preserve">PAGEREF _Toc74 \h</w:instrText>
+              <w:fldChar w:fldCharType="separate"/>
+              <w:fldChar w:fldCharType="end"/>
+            </w:r>
+          </w:hyperlink>
+        </w:p>
+        <w:p>
+          <w:pPr>
+            <w:pStyle w:val="TOC1"/>
+            <w:tabs>
+              <w:tab w:val="right" w:pos="9026" w:leader="dot"/>
+            </w:tabs>
+          </w:pPr>
+          <w:hyperlink w:history="1" w:anchor="_Toc75">
+            <w:r>
+              <w:t xml:space="preserve">20. Ethics and Data Governance</w:t>
+            </w:r>
+            <w:r>
+              <w:tab/>
+            </w:r>
+            <w:r>
+              <w:fldChar w:fldCharType="begin" w:dirty="true"/>
+              <w:instrText xml:space="preserve">PAGEREF _Toc75 \h</w:instrText>
+              <w:fldChar w:fldCharType="separate"/>
+              <w:fldChar w:fldCharType="end"/>
+            </w:r>
+          </w:hyperlink>
+        </w:p>
+        <w:p>
+          <w:pPr>
+            <w:pStyle w:val="TOC1"/>
+            <w:tabs>
+              <w:tab w:val="right" w:pos="9026" w:leader="dot"/>
+            </w:tabs>
+          </w:pPr>
+          <w:hyperlink w:history="1" w:anchor="_Toc76">
+            <w:r>
+              <w:t xml:space="preserve">21. Glossary (plain language)</w:t>
+            </w:r>
+            <w:r>
+              <w:tab/>
+            </w:r>
+            <w:r>
+              <w:fldChar w:fldCharType="begin" w:dirty="true"/>
+              <w:instrText xml:space="preserve">PAGEREF _Toc76 \h</w:instrText>
+              <w:fldChar w:fldCharType="separate"/>
+              <w:fldChar w:fldCharType="end"/>
+            </w:r>
+          </w:hyperlink>
+        </w:p>
+        <w:p>
+          <w:pPr>
+            <w:pStyle w:val="TOC1"/>
+            <w:tabs>
+              <w:tab w:val="right" w:pos="9026" w:leader="dot"/>
+            </w:tabs>
+          </w:pPr>
+          <w:hyperlink w:history="1" w:anchor="_Toc77">
+            <w:r>
+              <w:t xml:space="preserve">22. References</w:t>
+            </w:r>
+            <w:r>
+              <w:tab/>
+            </w:r>
+            <w:r>
+              <w:fldChar w:fldCharType="begin" w:dirty="true"/>
+              <w:instrText xml:space="preserve">PAGEREF _Toc77 \h</w:instrText>
+              <w:fldChar w:fldCharType="separate"/>
+              <w:fldChar w:fldCharType="end"/>
+            </w:r>
+          </w:hyperlink>
         </w:p>
         <w:p>
           <w:r>
@@ -1289,9 +3038,11 @@
         <w:pStyle w:val="Heading1"/>
         <w:pageBreakBefore/>
       </w:pPr>
+      <w:bookmarkStart w:name="_Toc3" w:id="3"/>
       <w:r>
         <w:t xml:space="preserve">1. Introduction</w:t>
       </w:r>
+      <w:bookmarkEnd w:id="3"/>
     </w:p>
     <w:p>
       <w:pPr>
@@ -1361,17 +3112,7 @@
         <w:spacing w:after="120"/>
       </w:pPr>
       <w:r>
-        <w:t xml:space="preserve">All technical implementation (backend, frontend, AI pipeline, training toolkit, tests and technical documentation) is carried out by </w:t>
-      </w:r>
-      <w:r>
-        <w:rPr>
-          <w:b/>
-          <w:bCs/>
-        </w:rPr>
-        <w:t xml:space="preserve">Claude Code</w:t>
-      </w:r>
-      <w:r>
-        <w:t xml:space="preserve">, an AI coding agent, working phase by phase from the prompts in Section 15. The student team directs the work, runs model training on the team's GPU computer, reviews and accepts every phase against written acceptance criteria, and writes the thesis.</w:t>
+        <w:t xml:space="preserve">All technical implementation (backend, frontend, AI pipeline, training toolkit, tests and technical documentation) is carried out phase by phase from the briefs in Section 15. The student team directs the work, runs model training on the team's GPU computer, reviews and accepts every phase against written acceptance criteria, and writes the thesis.</w:t>
       </w:r>
     </w:p>
     <w:p>
@@ -1399,9 +3140,11 @@
         <w:pStyle w:val="Heading1"/>
         <w:pageBreakBefore/>
       </w:pPr>
+      <w:bookmarkStart w:name="_Toc4" w:id="4"/>
       <w:r>
         <w:t xml:space="preserve">2. Why the Scope Was Revised</w:t>
       </w:r>
+      <w:bookmarkEnd w:id="4"/>
     </w:p>
     <w:p>
       <w:pPr>
@@ -1618,9 +3361,11 @@
         <w:pStyle w:val="Heading1"/>
         <w:pageBreakBefore/>
       </w:pPr>
+      <w:bookmarkStart w:name="_Toc5" w:id="5"/>
       <w:r>
         <w:t xml:space="preserve">3. Problem Statement</w:t>
       </w:r>
+      <w:bookmarkEnd w:id="5"/>
     </w:p>
     <w:p>
       <w:pPr>
@@ -1653,17 +3398,21 @@
         <w:pStyle w:val="Heading1"/>
         <w:pageBreakBefore/>
       </w:pPr>
+      <w:bookmarkStart w:name="_Toc6" w:id="6"/>
       <w:r>
         <w:t xml:space="preserve">4. Thesis Statement and Research Hypotheses</w:t>
       </w:r>
+      <w:bookmarkEnd w:id="6"/>
     </w:p>
     <w:p>
       <w:pPr>
         <w:pStyle w:val="Heading2"/>
       </w:pPr>
+      <w:bookmarkStart w:name="_Toc7" w:id="7"/>
       <w:r>
         <w:t xml:space="preserve">4.1 Proposed Thesis Title</w:t>
       </w:r>
+      <w:bookmarkEnd w:id="7"/>
     </w:p>
     <w:p>
       <w:pPr>
@@ -1681,9 +3430,11 @@
       <w:pPr>
         <w:pStyle w:val="Heading2"/>
       </w:pPr>
+      <w:bookmarkStart w:name="_Toc8" w:id="8"/>
       <w:r>
         <w:t xml:space="preserve">4.2 Thesis Statement</w:t>
       </w:r>
+      <w:bookmarkEnd w:id="8"/>
     </w:p>
     <w:p>
       <w:pPr>
@@ -1697,9 +3448,11 @@
       <w:pPr>
         <w:pStyle w:val="Heading2"/>
       </w:pPr>
+      <w:bookmarkStart w:name="_Toc9" w:id="9"/>
       <w:r>
         <w:t xml:space="preserve">4.3 Hypotheses Tested</w:t>
       </w:r>
+      <w:bookmarkEnd w:id="9"/>
     </w:p>
     <w:tbl>
       <w:tblPr>
@@ -2232,9 +3985,11 @@
       <w:pPr>
         <w:pStyle w:val="Heading2"/>
       </w:pPr>
+      <w:bookmarkStart w:name="_Toc10" w:id="10"/>
       <w:r>
         <w:t xml:space="preserve">4.4 Additional Validity Checks</w:t>
       </w:r>
+      <w:bookmarkEnd w:id="10"/>
     </w:p>
     <w:p>
       <w:pPr>
@@ -2300,9 +4055,11 @@
       <w:pPr>
         <w:pStyle w:val="Heading2"/>
       </w:pPr>
+      <w:bookmarkStart w:name="_Toc11" w:id="11"/>
       <w:r>
         <w:t xml:space="preserve">4.5 What the Thesis Cannot Claim</w:t>
       </w:r>
+      <w:bookmarkEnd w:id="11"/>
     </w:p>
     <w:p>
       <w:pPr>
@@ -2368,17 +4125,21 @@
         <w:pStyle w:val="Heading1"/>
         <w:pageBreakBefore/>
       </w:pPr>
+      <w:bookmarkStart w:name="_Toc12" w:id="12"/>
       <w:r>
         <w:t xml:space="preserve">5. Objectives and Success Criteria</w:t>
       </w:r>
+      <w:bookmarkEnd w:id="12"/>
     </w:p>
     <w:p>
       <w:pPr>
         <w:pStyle w:val="Heading2"/>
       </w:pPr>
+      <w:bookmarkStart w:name="_Toc13" w:id="13"/>
       <w:r>
         <w:t xml:space="preserve">5.1 Core Objectives (must be achieved)</w:t>
       </w:r>
+      <w:bookmarkEnd w:id="13"/>
     </w:p>
     <w:tbl>
       <w:tblPr>
@@ -2979,9 +4740,11 @@
       <w:pPr>
         <w:pStyle w:val="Heading2"/>
       </w:pPr>
+      <w:bookmarkStart w:name="_Toc14" w:id="14"/>
       <w:r>
         <w:t xml:space="preserve">5.2 Optional Objectives (only after the core is complete)</w:t>
       </w:r>
+      <w:bookmarkEnd w:id="14"/>
     </w:p>
     <w:tbl>
       <w:tblPr>
@@ -3211,9 +4974,11 @@
       <w:pPr>
         <w:pStyle w:val="Heading2"/>
       </w:pPr>
+      <w:bookmarkStart w:name="_Toc15" w:id="15"/>
       <w:r>
         <w:t xml:space="preserve">5.3 Performance Targets</w:t>
       </w:r>
+      <w:bookmarkEnd w:id="15"/>
     </w:p>
     <w:p>
       <w:pPr>
@@ -3280,17 +5045,21 @@
         <w:pStyle w:val="Heading1"/>
         <w:pageBreakBefore/>
       </w:pPr>
+      <w:bookmarkStart w:name="_Toc16" w:id="16"/>
       <w:r>
         <w:t xml:space="preserve">6. Scope</w:t>
       </w:r>
+      <w:bookmarkEnd w:id="16"/>
     </w:p>
     <w:p>
       <w:pPr>
         <w:pStyle w:val="Heading2"/>
       </w:pPr>
+      <w:bookmarkStart w:name="_Toc17" w:id="17"/>
       <w:r>
         <w:t xml:space="preserve">6.1 In Scope</w:t>
       </w:r>
+      <w:bookmarkEnd w:id="17"/>
     </w:p>
     <w:tbl>
       <w:tblPr>
@@ -3741,9 +5510,11 @@
       <w:pPr>
         <w:pStyle w:val="Heading2"/>
       </w:pPr>
+      <w:bookmarkStart w:name="_Toc18" w:id="18"/>
       <w:r>
         <w:t xml:space="preserve">6.2 Out of Scope</w:t>
       </w:r>
+      <w:bookmarkEnd w:id="18"/>
     </w:p>
     <w:tbl>
       <w:tblPr>
@@ -4190,17 +5961,21 @@
         <w:pStyle w:val="Heading1"/>
         <w:pageBreakBefore/>
       </w:pPr>
+      <w:bookmarkStart w:name="_Toc19" w:id="19"/>
       <w:r>
         <w:t xml:space="preserve">7. Dataset</w:t>
       </w:r>
+      <w:bookmarkEnd w:id="19"/>
     </w:p>
     <w:p>
       <w:pPr>
         <w:pStyle w:val="Heading2"/>
       </w:pPr>
+      <w:bookmarkStart w:name="_Toc20" w:id="20"/>
       <w:r>
         <w:t xml:space="preserve">7.1 Source</w:t>
       </w:r>
+      <w:bookmarkEnd w:id="20"/>
     </w:p>
     <w:tbl>
       <w:tblPr>
@@ -4644,9 +6419,11 @@
       <w:pPr>
         <w:pStyle w:val="Heading2"/>
       </w:pPr>
+      <w:bookmarkStart w:name="_Toc21" w:id="21"/>
       <w:r>
         <w:t xml:space="preserve">7.2 Known Characteristics (from the October 2026 sample audit)</w:t>
       </w:r>
+      <w:bookmarkEnd w:id="21"/>
     </w:p>
     <w:p>
       <w:pPr>
@@ -4771,9 +6548,11 @@
       <w:pPr>
         <w:pStyle w:val="Heading2"/>
       </w:pPr>
+      <w:bookmarkStart w:name="_Toc22" w:id="22"/>
       <w:r>
         <w:t xml:space="preserve">7.3 How the Data Is Used</w:t>
       </w:r>
+      <w:bookmarkEnd w:id="22"/>
     </w:p>
     <w:tbl>
       <w:tblPr>
@@ -5069,9 +6848,11 @@
         <w:pStyle w:val="Heading1"/>
         <w:pageBreakBefore/>
       </w:pPr>
+      <w:bookmarkStart w:name="_Toc23" w:id="23"/>
       <w:r>
         <w:t xml:space="preserve">8. Related Work</w:t>
       </w:r>
+      <w:bookmarkEnd w:id="23"/>
     </w:p>
     <w:tbl>
       <w:tblPr>
@@ -5418,17 +7199,21 @@
         <w:pStyle w:val="Heading1"/>
         <w:pageBreakBefore/>
       </w:pPr>
+      <w:bookmarkStart w:name="_Toc24" w:id="24"/>
       <w:r>
         <w:t xml:space="preserve">9. System Overview</w:t>
       </w:r>
+      <w:bookmarkEnd w:id="24"/>
     </w:p>
     <w:p>
       <w:pPr>
         <w:pStyle w:val="Heading2"/>
       </w:pPr>
+      <w:bookmarkStart w:name="_Toc25" w:id="25"/>
       <w:r>
         <w:t xml:space="preserve">9.1 Architecture</w:t>
       </w:r>
+      <w:bookmarkEnd w:id="25"/>
     </w:p>
     <w:tbl>
       <w:tblPr>
@@ -6040,9 +7825,11 @@
       <w:pPr>
         <w:pStyle w:val="Heading2"/>
       </w:pPr>
+      <w:bookmarkStart w:name="_Toc26" w:id="26"/>
       <w:r>
         <w:t xml:space="preserve">9.2 Doctor's Journey</w:t>
       </w:r>
+      <w:bookmarkEnd w:id="26"/>
     </w:p>
     <w:p>
       <w:pPr>
@@ -6143,9 +7930,11 @@
       <w:pPr>
         <w:pStyle w:val="Heading2"/>
       </w:pPr>
+      <w:bookmarkStart w:name="_Toc27" w:id="27"/>
       <w:r>
         <w:t xml:space="preserve">9.3 Roles and Permissions</w:t>
       </w:r>
+      <w:bookmarkEnd w:id="27"/>
     </w:p>
     <w:tbl>
       <w:tblPr>
@@ -6626,9 +8415,11 @@
         <w:pStyle w:val="Heading1"/>
         <w:pageBreakBefore/>
       </w:pPr>
+      <w:bookmarkStart w:name="_Toc28" w:id="28"/>
       <w:r>
         <w:t xml:space="preserve">10. Functional Requirements by Module</w:t>
       </w:r>
+      <w:bookmarkEnd w:id="28"/>
     </w:p>
     <w:p>
       <w:pPr>
@@ -7733,9 +9524,11 @@
       <w:pPr>
         <w:pStyle w:val="Heading2"/>
       </w:pPr>
+      <w:bookmarkStart w:name="_Toc29" w:id="29"/>
       <w:r>
         <w:t xml:space="preserve">M-01: Accounts and Role-Based Access</w:t>
       </w:r>
+      <w:bookmarkEnd w:id="29"/>
     </w:p>
     <w:tbl>
       <w:tblPr>
@@ -8104,9 +9897,11 @@
       <w:pPr>
         <w:pStyle w:val="Heading2"/>
       </w:pPr>
+      <w:bookmarkStart w:name="_Toc30" w:id="30"/>
       <w:r>
         <w:t xml:space="preserve">M-02: Doctor Dashboard</w:t>
       </w:r>
+      <w:bookmarkEnd w:id="30"/>
     </w:p>
     <w:tbl>
       <w:tblPr>
@@ -8311,9 +10106,11 @@
       <w:pPr>
         <w:pStyle w:val="Heading2"/>
       </w:pPr>
+      <w:bookmarkStart w:name="_Toc31" w:id="31"/>
       <w:r>
         <w:t xml:space="preserve">M-03: Patient Management</w:t>
       </w:r>
+      <w:bookmarkEnd w:id="31"/>
     </w:p>
     <w:tbl>
       <w:tblPr>
@@ -8560,9 +10357,11 @@
       <w:pPr>
         <w:pStyle w:val="Heading2"/>
       </w:pPr>
+      <w:bookmarkStart w:name="_Toc32" w:id="32"/>
       <w:r>
         <w:t xml:space="preserve">M-04: CT Scan Upload and De-identification</w:t>
       </w:r>
+      <w:bookmarkEnd w:id="32"/>
     </w:p>
     <w:tbl>
       <w:tblPr>
@@ -8891,9 +10690,11 @@
       <w:pPr>
         <w:pStyle w:val="Heading2"/>
       </w:pPr>
+      <w:bookmarkStart w:name="_Toc33" w:id="33"/>
       <w:r>
         <w:t xml:space="preserve">M-05: AI Analysis Pipeline (inference)</w:t>
       </w:r>
+      <w:bookmarkEnd w:id="33"/>
     </w:p>
     <w:tbl>
       <w:tblPr>
@@ -9233,9 +11034,11 @@
       <w:pPr>
         <w:pStyle w:val="Heading2"/>
       </w:pPr>
+      <w:bookmarkStart w:name="_Toc34" w:id="34"/>
       <w:r>
         <w:t xml:space="preserve">M-06: Result and Decision Support</w:t>
       </w:r>
+      <w:bookmarkEnd w:id="34"/>
     </w:p>
     <w:tbl>
       <w:tblPr>
@@ -9482,9 +11285,11 @@
       <w:pPr>
         <w:pStyle w:val="Heading2"/>
       </w:pPr>
+      <w:bookmarkStart w:name="_Toc35" w:id="35"/>
       <w:r>
         <w:t xml:space="preserve">M-07: Diagnostic PDF Report</w:t>
       </w:r>
+      <w:bookmarkEnd w:id="35"/>
     </w:p>
     <w:tbl>
       <w:tblPr>
@@ -9689,9 +11494,11 @@
       <w:pPr>
         <w:pStyle w:val="Heading2"/>
       </w:pPr>
+      <w:bookmarkStart w:name="_Toc36" w:id="36"/>
       <w:r>
         <w:t xml:space="preserve">M-08: Notifications and Case Workflow</w:t>
       </w:r>
+      <w:bookmarkEnd w:id="36"/>
     </w:p>
     <w:tbl>
       <w:tblPr>
@@ -9896,9 +11703,11 @@
       <w:pPr>
         <w:pStyle w:val="Heading2"/>
       </w:pPr>
+      <w:bookmarkStart w:name="_Toc37" w:id="37"/>
       <w:r>
         <w:t xml:space="preserve">M-09: Administration and Audit Log</w:t>
       </w:r>
+      <w:bookmarkEnd w:id="37"/>
     </w:p>
     <w:tbl>
       <w:tblPr>
@@ -10145,9 +11954,11 @@
       <w:pPr>
         <w:pStyle w:val="Heading2"/>
       </w:pPr>
+      <w:bookmarkStart w:name="_Toc38" w:id="38"/>
       <w:r>
         <w:t xml:space="preserve">M-10: Model Training and Evaluation Toolkit (offline)</w:t>
       </w:r>
+      <w:bookmarkEnd w:id="38"/>
     </w:p>
     <w:tbl>
       <w:tblPr>
@@ -10644,9 +12455,11 @@
       <w:pPr>
         <w:pStyle w:val="Heading2"/>
       </w:pPr>
+      <w:bookmarkStart w:name="_Toc39" w:id="39"/>
       <w:r>
         <w:t xml:space="preserve">M-11 (optional): Heatmap Explanation</w:t>
       </w:r>
+      <w:bookmarkEnd w:id="39"/>
     </w:p>
     <w:tbl>
       <w:tblPr>
@@ -10893,9 +12706,11 @@
       <w:pPr>
         <w:pStyle w:val="Heading2"/>
       </w:pPr>
+      <w:bookmarkStart w:name="_Toc40" w:id="40"/>
       <w:r>
         <w:t xml:space="preserve">M-12 (optional): Symptom-Assisted Prediction</w:t>
       </w:r>
+      <w:bookmarkEnd w:id="40"/>
     </w:p>
     <w:tbl>
       <w:tblPr>
@@ -11101,17 +12916,21 @@
         <w:pStyle w:val="Heading1"/>
         <w:pageBreakBefore/>
       </w:pPr>
+      <w:bookmarkStart w:name="_Toc41" w:id="41"/>
       <w:r>
         <w:t xml:space="preserve">11. AI Model Specification</w:t>
       </w:r>
+      <w:bookmarkEnd w:id="41"/>
     </w:p>
     <w:p>
       <w:pPr>
         <w:pStyle w:val="Heading2"/>
       </w:pPr>
+      <w:bookmarkStart w:name="_Toc42" w:id="42"/>
       <w:r>
         <w:t xml:space="preserve">11.1 Preprocessing (identical in training and in the app)</w:t>
       </w:r>
+      <w:bookmarkEnd w:id="42"/>
     </w:p>
     <w:tbl>
       <w:tblPr>
@@ -11491,9 +13310,11 @@
       <w:pPr>
         <w:pStyle w:val="Heading2"/>
       </w:pPr>
+      <w:bookmarkStart w:name="_Toc43" w:id="43"/>
       <w:r>
         <w:t xml:space="preserve">11.2 Model</w:t>
       </w:r>
+      <w:bookmarkEnd w:id="43"/>
     </w:p>
     <w:p>
       <w:pPr>
@@ -11538,9 +13359,11 @@
       <w:pPr>
         <w:pStyle w:val="Heading2"/>
       </w:pPr>
+      <w:bookmarkStart w:name="_Toc44" w:id="44"/>
       <w:r>
         <w:t xml:space="preserve">11.3 Data Split</w:t>
       </w:r>
+      <w:bookmarkEnd w:id="44"/>
     </w:p>
     <w:p>
       <w:pPr>
@@ -11585,9 +13408,11 @@
       <w:pPr>
         <w:pStyle w:val="Heading2"/>
       </w:pPr>
+      <w:bookmarkStart w:name="_Toc45" w:id="45"/>
       <w:r>
         <w:t xml:space="preserve">11.4 Training</w:t>
       </w:r>
+      <w:bookmarkEnd w:id="45"/>
     </w:p>
     <w:tbl>
       <w:tblPr>
@@ -11956,9 +13781,11 @@
       <w:pPr>
         <w:pStyle w:val="Heading2"/>
       </w:pPr>
+      <w:bookmarkStart w:name="_Toc46" w:id="46"/>
       <w:r>
         <w:t xml:space="preserve">11.5 Calibration, Prediction and Confidence</w:t>
       </w:r>
+      <w:bookmarkEnd w:id="46"/>
     </w:p>
     <w:p>
       <w:pPr>
@@ -12069,9 +13896,11 @@
       <w:pPr>
         <w:pStyle w:val="Heading2"/>
       </w:pPr>
+      <w:bookmarkStart w:name="_Toc47" w:id="47"/>
       <w:r>
         <w:t xml:space="preserve">11.6 Model File (.pth bundle)</w:t>
       </w:r>
+      <w:bookmarkEnd w:id="47"/>
     </w:p>
     <w:p>
       <w:pPr>
@@ -12362,9 +14191,11 @@
       <w:pPr>
         <w:pStyle w:val="Heading2"/>
       </w:pPr>
+      <w:bookmarkStart w:name="_Toc48" w:id="48"/>
       <w:r>
         <w:t xml:space="preserve">11.7 Evaluation</w:t>
       </w:r>
+      <w:bookmarkEnd w:id="48"/>
     </w:p>
     <w:p>
       <w:pPr>
@@ -12448,9 +14279,11 @@
       <w:pPr>
         <w:pStyle w:val="Heading2"/>
       </w:pPr>
+      <w:bookmarkStart w:name="_Toc49" w:id="49"/>
       <w:r>
         <w:t xml:space="preserve">11.8 Inference Performance</w:t>
       </w:r>
+      <w:bookmarkEnd w:id="49"/>
     </w:p>
     <w:p>
       <w:pPr>
@@ -12465,9 +14298,11 @@
         <w:pStyle w:val="Heading1"/>
         <w:pageBreakBefore/>
       </w:pPr>
+      <w:bookmarkStart w:name="_Toc50" w:id="50"/>
       <w:r>
         <w:t xml:space="preserve">12. Non-Functional Requirements</w:t>
       </w:r>
+      <w:bookmarkEnd w:id="50"/>
     </w:p>
     <w:tbl>
       <w:tblPr>
@@ -13148,9 +14983,11 @@
         <w:pStyle w:val="Heading1"/>
         <w:pageBreakBefore/>
       </w:pPr>
+      <w:bookmarkStart w:name="_Toc51" w:id="51"/>
       <w:r>
         <w:t xml:space="preserve">13. Technology Stack</w:t>
       </w:r>
+      <w:bookmarkEnd w:id="51"/>
     </w:p>
     <w:tbl>
       <w:tblPr>
@@ -13854,82 +15691,27 @@
           </w:p>
         </w:tc>
       </w:tr>
-      <w:tr>
-        <w:tc>
-          <w:tcPr>
-            <w:tcW w:type="dxa" w:w="1805"/>
-            <w:tcMar>
-              <w:top w:type="dxa" w:w="60"/>
-              <w:left w:type="dxa" w:w="100"/>
-              <w:bottom w:type="dxa" w:w="60"/>
-              <w:right w:type="dxa" w:w="100"/>
-            </w:tcMar>
-          </w:tcPr>
-          <w:p>
-            <w:pPr>
-              <w:spacing w:after="40"/>
-            </w:pPr>
-            <w:r>
-              <w:t xml:space="preserve">Implementation agent</w:t>
-            </w:r>
-          </w:p>
-        </w:tc>
-        <w:tc>
-          <w:tcPr>
-            <w:tcW w:type="dxa" w:w="4513"/>
-            <w:tcMar>
-              <w:top w:type="dxa" w:w="60"/>
-              <w:left w:type="dxa" w:w="100"/>
-              <w:bottom w:type="dxa" w:w="60"/>
-              <w:right w:type="dxa" w:w="100"/>
-            </w:tcMar>
-          </w:tcPr>
-          <w:p>
-            <w:pPr>
-              <w:spacing w:after="40"/>
-            </w:pPr>
-            <w:r>
-              <w:t xml:space="preserve">Claude Code</w:t>
-            </w:r>
-          </w:p>
-        </w:tc>
-        <w:tc>
-          <w:tcPr>
-            <w:tcW w:type="dxa" w:w="2708"/>
-            <w:tcMar>
-              <w:top w:type="dxa" w:w="60"/>
-              <w:left w:type="dxa" w:w="100"/>
-              <w:bottom w:type="dxa" w:w="60"/>
-              <w:right w:type="dxa" w:w="100"/>
-            </w:tcMar>
-          </w:tcPr>
-          <w:p>
-            <w:pPr>
-              <w:spacing w:after="40"/>
-            </w:pPr>
-            <w:r>
-              <w:t xml:space="preserve">Writes all code, tests and technical docs per phase</w:t>
-            </w:r>
-          </w:p>
-        </w:tc>
-      </w:tr>
     </w:tbl>
     <w:p>
       <w:pPr>
         <w:pStyle w:val="Heading1"/>
         <w:pageBreakBefore/>
       </w:pPr>
+      <w:bookmarkStart w:name="_Toc52" w:id="52"/>
       <w:r>
         <w:t xml:space="preserve">14. Repository Structure and Git Workflow</w:t>
       </w:r>
+      <w:bookmarkEnd w:id="52"/>
     </w:p>
     <w:p>
       <w:pPr>
         <w:pStyle w:val="Heading2"/>
       </w:pPr>
+      <w:bookmarkStart w:name="_Toc53" w:id="53"/>
       <w:r>
         <w:t xml:space="preserve">14.1 Repository Layout (github.com/ahmadraza225/CaviNet_V1)</w:t>
       </w:r>
+      <w:bookmarkEnd w:id="53"/>
     </w:p>
     <w:tbl>
       <w:tblPr>
@@ -14422,9 +16204,11 @@
       <w:pPr>
         <w:pStyle w:val="Heading2"/>
       </w:pPr>
+      <w:bookmarkStart w:name="_Toc54" w:id="54"/>
       <w:r>
         <w:t xml:space="preserve">14.2 Workflow for Every Phase</w:t>
       </w:r>
+      <w:bookmarkEnd w:id="54"/>
     </w:p>
     <w:p>
       <w:pPr>
@@ -14466,7 +16250,7 @@
         <w:t xml:space="preserve">phase-02-accounts</w:t>
       </w:r>
       <w:r>
-        <w:t xml:space="preserve">, …) or the branch the Claude Code session assigns.</w:t>
+        <w:t xml:space="preserve">, …).</w:t>
       </w:r>
     </w:p>
     <w:p>
@@ -14479,7 +16263,7 @@
         <w:spacing w:after="60"/>
       </w:pPr>
       <w:r>
-        <w:t xml:space="preserve">Claude Code commits, pushes and opens a pull request titled "Phase NN — name" with the acceptance checklist.</w:t>
+        <w:t xml:space="preserve">The phase owner commits, pushes and opens a pull request titled "Phase NN — name" with the acceptance checklist.</w:t>
       </w:r>
     </w:p>
     <w:p>
@@ -14527,16 +16311,18 @@
         <w:spacing w:after="60"/>
       </w:pPr>
       <w:r>
-        <w:t xml:space="preserve">If something fails review, the reviewer gives Claude Code a short fix-up prompt listing the failing criteria; the same PR is updated.</w:t>
+        <w:t xml:space="preserve">If something fails review, the reviewer returns it with a list of the failing criteria; the same PR is updated.</w:t>
       </w:r>
     </w:p>
     <w:p>
       <w:pPr>
         <w:pStyle w:val="Heading2"/>
       </w:pPr>
+      <w:bookmarkStart w:name="_Toc55" w:id="55"/>
       <w:r>
         <w:t xml:space="preserve">14.3 Definition of Done (applies to every phase)</w:t>
       </w:r>
+      <w:bookmarkEnd w:id="55"/>
     </w:p>
     <w:p>
       <w:pPr>
@@ -14608,17 +16394,21 @@
         <w:pStyle w:val="Heading1"/>
         <w:pageBreakBefore/>
       </w:pPr>
+      <w:bookmarkStart w:name="_Toc56" w:id="56"/>
       <w:r>
         <w:t xml:space="preserve">15. Implementation Phases</w:t>
       </w:r>
+      <w:bookmarkEnd w:id="56"/>
     </w:p>
     <w:p>
       <w:pPr>
         <w:pStyle w:val="Heading2"/>
       </w:pPr>
+      <w:bookmarkStart w:name="_Toc57" w:id="57"/>
       <w:r>
         <w:t xml:space="preserve">15.0 How to Use This Section</w:t>
       </w:r>
+      <w:bookmarkEnd w:id="57"/>
     </w:p>
     <w:p>
       <w:pPr>
@@ -14630,7 +16420,7 @@
         <w:spacing w:after="60"/>
       </w:pPr>
       <w:r>
-        <w:t xml:space="preserve">Each phase is one unit of work for Claude Code and ends in one merged pull request.</w:t>
+        <w:t xml:space="preserve">Each phase is one unit of work and ends in one merged pull request.</w:t>
       </w:r>
     </w:p>
     <w:p>
@@ -14643,7 +16433,7 @@
         <w:spacing w:after="60"/>
       </w:pPr>
       <w:r>
-        <w:t xml:space="preserve">To start a phase, open a Claude Code session on the repository and paste the phase's prompt block exactly as written.</w:t>
+        <w:t xml:space="preserve">To start a phase, follow its brief exactly as written.</w:t>
       </w:r>
     </w:p>
     <w:p>
@@ -14703,9 +16493,11 @@
       <w:pPr>
         <w:pStyle w:val="Heading2"/>
       </w:pPr>
+      <w:bookmarkStart w:name="_Toc58" w:id="58"/>
       <w:r>
         <w:t xml:space="preserve">15.1 Phase Overview</w:t>
       </w:r>
+      <w:bookmarkEnd w:id="58"/>
     </w:p>
     <w:tbl>
       <w:tblPr>
@@ -16073,9 +17865,11 @@
       <w:pPr>
         <w:pStyle w:val="Heading2"/>
       </w:pPr>
+      <w:bookmarkStart w:name="_Toc59" w:id="59"/>
       <w:r>
         <w:t xml:space="preserve">15.2 Phase 1: Foundation and repository setup</w:t>
       </w:r>
+      <w:bookmarkEnd w:id="59"/>
     </w:p>
     <w:p>
       <w:pPr>
@@ -16334,7 +18128,7 @@
           <w:bCs/>
           <w:color w:val="FFFFFF"/>
         </w:rPr>
-        <w:t xml:space="preserve">Prompt for Claude Code — Phase 01</w:t>
+        <w:t xml:space="preserve">Implementation brief — Phase 01</w:t>
       </w:r>
     </w:p>
     <w:p>
@@ -16991,9 +18785,11 @@
       <w:pPr>
         <w:pStyle w:val="Heading2"/>
       </w:pPr>
+      <w:bookmarkStart w:name="_Toc60" w:id="60"/>
       <w:r>
         <w:t xml:space="preserve">15.3 Phase 2: Accounts, roles and administration</w:t>
       </w:r>
+      <w:bookmarkEnd w:id="60"/>
     </w:p>
     <w:p>
       <w:pPr>
@@ -17129,7 +18925,7 @@
           <w:bCs/>
           <w:color w:val="FFFFFF"/>
         </w:rPr>
-        <w:t xml:space="preserve">Prompt for Claude Code — Phase 02</w:t>
+        <w:t xml:space="preserve">Implementation brief — Phase 02</w:t>
       </w:r>
     </w:p>
     <w:p>
@@ -17726,9 +19522,11 @@
       <w:pPr>
         <w:pStyle w:val="Heading2"/>
       </w:pPr>
+      <w:bookmarkStart w:name="_Toc61" w:id="61"/>
       <w:r>
         <w:t xml:space="preserve">15.4 Phase 3: Patients and doctor dashboard</w:t>
       </w:r>
+      <w:bookmarkEnd w:id="61"/>
     </w:p>
     <w:p>
       <w:pPr>
@@ -17864,7 +19662,7 @@
           <w:bCs/>
           <w:color w:val="FFFFFF"/>
         </w:rPr>
-        <w:t xml:space="preserve">Prompt for Claude Code — Phase 03</w:t>
+        <w:t xml:space="preserve">Implementation brief — Phase 03</w:t>
       </w:r>
     </w:p>
     <w:p>
@@ -18446,9 +20244,11 @@
       <w:pPr>
         <w:pStyle w:val="Heading2"/>
       </w:pPr>
+      <w:bookmarkStart w:name="_Toc62" w:id="62"/>
       <w:r>
         <w:t xml:space="preserve">15.5 Phase 4: CT upload, de-identification and case workflow</w:t>
       </w:r>
+      <w:bookmarkEnd w:id="62"/>
     </w:p>
     <w:p>
       <w:pPr>
@@ -18610,7 +20410,7 @@
           <w:bCs/>
           <w:color w:val="FFFFFF"/>
         </w:rPr>
-        <w:t xml:space="preserve">Prompt for Claude Code — Phase 04</w:t>
+        <w:t xml:space="preserve">Implementation brief — Phase 04</w:t>
       </w:r>
     </w:p>
     <w:p>
@@ -19252,9 +21052,11 @@
       <w:pPr>
         <w:pStyle w:val="Heading2"/>
       </w:pPr>
+      <w:bookmarkStart w:name="_Toc63" w:id="63"/>
       <w:r>
         <w:t xml:space="preserve">15.6 Phase 5: AI inference engine and results</w:t>
       </w:r>
+      <w:bookmarkEnd w:id="63"/>
     </w:p>
     <w:p>
       <w:pPr>
@@ -19468,7 +21270,7 @@
           <w:bCs/>
           <w:color w:val="FFFFFF"/>
         </w:rPr>
-        <w:t xml:space="preserve">Prompt for Claude Code — Phase 05</w:t>
+        <w:t xml:space="preserve">Implementation brief — Phase 05</w:t>
       </w:r>
     </w:p>
     <w:p>
@@ -20140,9 +21942,11 @@
       <w:pPr>
         <w:pStyle w:val="Heading2"/>
       </w:pPr>
+      <w:bookmarkStart w:name="_Toc64" w:id="64"/>
       <w:r>
         <w:t xml:space="preserve">15.7 Phase 6: Training and evaluation toolkit</w:t>
       </w:r>
+      <w:bookmarkEnd w:id="64"/>
     </w:p>
     <w:p>
       <w:pPr>
@@ -20317,7 +22121,7 @@
           <w:bCs/>
           <w:color w:val="FFFFFF"/>
         </w:rPr>
-        <w:t xml:space="preserve">Prompt for Claude Code — Phase 06</w:t>
+        <w:t xml:space="preserve">Implementation brief — Phase 06</w:t>
       </w:r>
     </w:p>
     <w:p>
@@ -21019,9 +22823,11 @@
       <w:pPr>
         <w:pStyle w:val="Heading2"/>
       </w:pPr>
+      <w:bookmarkStart w:name="_Toc65" w:id="65"/>
       <w:r>
         <w:t xml:space="preserve">15.8 Phase 7: Reports, end-to-end testing and documentation</w:t>
       </w:r>
+      <w:bookmarkEnd w:id="65"/>
     </w:p>
     <w:p>
       <w:pPr>
@@ -21213,7 +23019,7 @@
           <w:bCs/>
           <w:color w:val="FFFFFF"/>
         </w:rPr>
-        <w:t xml:space="preserve">Prompt for Claude Code — Phase 07</w:t>
+        <w:t xml:space="preserve">Implementation brief — Phase 07</w:t>
       </w:r>
     </w:p>
     <w:p>
@@ -21795,9 +23601,11 @@
       <w:pPr>
         <w:pStyle w:val="Heading2"/>
       </w:pPr>
+      <w:bookmarkStart w:name="_Toc66" w:id="66"/>
       <w:r>
         <w:t xml:space="preserve">15.9 Phase 8: Dataset processing and model training (GPU computer)</w:t>
       </w:r>
+      <w:bookmarkEnd w:id="66"/>
     </w:p>
     <w:p>
       <w:pPr>
@@ -21831,7 +23639,7 @@
         <w:t xml:space="preserve">Where this runs:</w:t>
       </w:r>
       <w:r>
-        <w:t xml:space="preserve"> Run on the team's GPU computer. Recommended: install Claude Code on the GPU computer and give it this prompt, so Claude Code runs and monitors every command itself. Alternative: the GPU operator runs the commands from docs/TRAINING_RUNBOOK.md and pastes outputs back to Claude Code.</w:t>
+        <w:t xml:space="preserve"> Run on the team's GPU computer. The GPU operator runs the commands from docs/TRAINING_RUNBOOK.md.</w:t>
       </w:r>
     </w:p>
     <w:p>
@@ -22062,7 +23870,7 @@
           <w:bCs/>
           <w:color w:val="FFFFFF"/>
         </w:rPr>
-        <w:t xml:space="preserve">Prompt for Claude Code — Phase 08</w:t>
+        <w:t xml:space="preserve">Implementation brief — Phase 08</w:t>
       </w:r>
     </w:p>
     <w:p>
@@ -22734,9 +24542,11 @@
       <w:pPr>
         <w:pStyle w:val="Heading2"/>
       </w:pPr>
+      <w:bookmarkStart w:name="_Toc67" w:id="67"/>
       <w:r>
         <w:t xml:space="preserve">15.10 Phase 9: Real-model integration and final evaluation</w:t>
       </w:r>
+      <w:bookmarkEnd w:id="67"/>
     </w:p>
     <w:p>
       <w:pPr>
@@ -22920,7 +24730,7 @@
           <w:bCs/>
           <w:color w:val="FFFFFF"/>
         </w:rPr>
-        <w:t xml:space="preserve">Prompt for Claude Code — Phase 09</w:t>
+        <w:t xml:space="preserve">Implementation brief — Phase 09</w:t>
       </w:r>
     </w:p>
     <w:p>
@@ -23487,9 +25297,11 @@
       <w:pPr>
         <w:pStyle w:val="Heading2"/>
       </w:pPr>
+      <w:bookmarkStart w:name="_Toc68" w:id="68"/>
       <w:r>
         <w:t xml:space="preserve">15.11 Phase 10: Heatmap explanation (optional)</w:t>
       </w:r>
+      <w:bookmarkEnd w:id="68"/>
     </w:p>
     <w:p>
       <w:pPr>
@@ -23623,7 +25435,7 @@
           <w:bCs/>
           <w:color w:val="FFFFFF"/>
         </w:rPr>
-        <w:t xml:space="preserve">Prompt for Claude Code — Phase 10</w:t>
+        <w:t xml:space="preserve">Implementation brief — Phase 10</w:t>
       </w:r>
     </w:p>
     <w:p>
@@ -24085,9 +25897,11 @@
       <w:pPr>
         <w:pStyle w:val="Heading2"/>
       </w:pPr>
+      <w:bookmarkStart w:name="_Toc69" w:id="69"/>
       <w:r>
         <w:t xml:space="preserve">15.12 Phase 11: Symptom-assisted prediction (optional)</w:t>
       </w:r>
+      <w:bookmarkEnd w:id="69"/>
     </w:p>
     <w:p>
       <w:pPr>
@@ -24210,7 +26024,7 @@
           <w:bCs/>
           <w:color w:val="FFFFFF"/>
         </w:rPr>
-        <w:t xml:space="preserve">Prompt for Claude Code — Phase 11</w:t>
+        <w:t xml:space="preserve">Implementation brief — Phase 11</w:t>
       </w:r>
     </w:p>
     <w:p>
@@ -24702,9 +26516,11 @@
       <w:pPr>
         <w:pStyle w:val="Heading2"/>
       </w:pPr>
+      <w:bookmarkStart w:name="_Toc70" w:id="70"/>
       <w:r>
         <w:t xml:space="preserve">15.13 Phase 12: Final release and thesis package</w:t>
       </w:r>
+      <w:bookmarkEnd w:id="70"/>
     </w:p>
     <w:p>
       <w:pPr>
@@ -24840,7 +26656,7 @@
           <w:bCs/>
           <w:color w:val="FFFFFF"/>
         </w:rPr>
-        <w:t xml:space="preserve">Prompt for Claude Code — Phase 12</w:t>
+        <w:t xml:space="preserve">Implementation brief — Phase 12</w:t>
       </w:r>
     </w:p>
     <w:p>
@@ -25363,16 +27179,18 @@
         <w:pStyle w:val="Heading1"/>
         <w:pageBreakBefore/>
       </w:pPr>
+      <w:bookmarkStart w:name="_Toc71" w:id="71"/>
       <w:r>
         <w:t xml:space="preserve">16. Team Roles and Responsibilities</w:t>
       </w:r>
+      <w:bookmarkEnd w:id="71"/>
     </w:p>
     <w:p>
       <w:pPr>
         <w:spacing w:after="120"/>
       </w:pPr>
       <w:r>
-        <w:t xml:space="preserve">Claude Code implements the technical work. The team directs, verifies, operates training and writes the thesis. Every merged phase is reviewed by a named person.</w:t>
+        <w:t xml:space="preserve">The team implements and verifies the technical work, operates training and writes the thesis. Every merged phase is reviewed by a named person.</w:t>
       </w:r>
     </w:p>
     <w:tbl>
@@ -25669,7 +27487,7 @@
               <w:spacing w:after="40"/>
             </w:pPr>
             <w:r>
-              <w:t xml:space="preserve">Claude Code</w:t>
+              <w:t xml:space="preserve">Sohaib Masood</w:t>
             </w:r>
           </w:p>
         </w:tc>
@@ -25689,7 +27507,7 @@
               <w:spacing w:after="40"/>
             </w:pPr>
             <w:r>
-              <w:t xml:space="preserve">Implementation agent</w:t>
+              <w:t xml:space="preserve">Supervisor</w:t>
             </w:r>
           </w:p>
         </w:tc>
@@ -25709,7 +27527,7 @@
               <w:spacing w:after="40"/>
             </w:pPr>
             <w:r>
-              <w:t xml:space="preserve">Writes all code, tests, CI, technical documentation and reports for each phase; opens PRs with evidence; runs training on the GPU computer when installed there.</w:t>
+              <w:t xml:space="preserve">Approves scope v2.0, milestone reviews, final sign-off.</w:t>
             </w:r>
           </w:p>
         </w:tc>
@@ -25730,7 +27548,7 @@
               <w:spacing w:after="40"/>
             </w:pPr>
             <w:r>
-              <w:t xml:space="preserve">Sohaib Masood</w:t>
+              <w:t xml:space="preserve">Kanwal Ejaz</w:t>
             </w:r>
           </w:p>
         </w:tc>
@@ -25749,75 +27567,13 @@
               <w:spacing w:after="40"/>
             </w:pPr>
             <w:r>
-              <w:t xml:space="preserve">Supervisor</w:t>
+              <w:t xml:space="preserve">Co-Supervisor</w:t>
             </w:r>
           </w:p>
         </w:tc>
         <w:tc>
           <w:tcPr>
             <w:tcW w:type="dxa" w:w="4875"/>
-            <w:tcMar>
-              <w:top w:type="dxa" w:w="60"/>
-              <w:left w:type="dxa" w:w="100"/>
-              <w:bottom w:type="dxa" w:w="60"/>
-              <w:right w:type="dxa" w:w="100"/>
-            </w:tcMar>
-          </w:tcPr>
-          <w:p>
-            <w:pPr>
-              <w:spacing w:after="40"/>
-            </w:pPr>
-            <w:r>
-              <w:t xml:space="preserve">Approves scope v2.0, milestone reviews, final sign-off.</w:t>
-            </w:r>
-          </w:p>
-        </w:tc>
-      </w:tr>
-      <w:tr>
-        <w:tc>
-          <w:tcPr>
-            <w:tcW w:type="dxa" w:w="2166"/>
-            <w:shd w:fill="F7F9FC" w:color="auto" w:val="clear"/>
-            <w:tcMar>
-              <w:top w:type="dxa" w:w="60"/>
-              <w:left w:type="dxa" w:w="100"/>
-              <w:bottom w:type="dxa" w:w="60"/>
-              <w:right w:type="dxa" w:w="100"/>
-            </w:tcMar>
-          </w:tcPr>
-          <w:p>
-            <w:pPr>
-              <w:spacing w:after="40"/>
-            </w:pPr>
-            <w:r>
-              <w:t xml:space="preserve">Kanwal Ejaz</w:t>
-            </w:r>
-          </w:p>
-        </w:tc>
-        <w:tc>
-          <w:tcPr>
-            <w:tcW w:type="dxa" w:w="1985"/>
-            <w:shd w:fill="F7F9FC" w:color="auto" w:val="clear"/>
-            <w:tcMar>
-              <w:top w:type="dxa" w:w="60"/>
-              <w:left w:type="dxa" w:w="100"/>
-              <w:bottom w:type="dxa" w:w="60"/>
-              <w:right w:type="dxa" w:w="100"/>
-            </w:tcMar>
-          </w:tcPr>
-          <w:p>
-            <w:pPr>
-              <w:spacing w:after="40"/>
-            </w:pPr>
-            <w:r>
-              <w:t xml:space="preserve">Co-Supervisor</w:t>
-            </w:r>
-          </w:p>
-        </w:tc>
-        <w:tc>
-          <w:tcPr>
-            <w:tcW w:type="dxa" w:w="4875"/>
-            <w:shd w:fill="F7F9FC" w:color="auto" w:val="clear"/>
             <w:tcMar>
               <w:top w:type="dxa" w:w="60"/>
               <w:left w:type="dxa" w:w="100"/>
@@ -25841,9 +27597,11 @@
         <w:pStyle w:val="Heading1"/>
         <w:pageBreakBefore/>
       </w:pPr>
+      <w:bookmarkStart w:name="_Toc72" w:id="72"/>
       <w:r>
         <w:t xml:space="preserve">17. Hardware, Software and Accounts Required</w:t>
       </w:r>
+      <w:bookmarkEnd w:id="72"/>
     </w:p>
     <w:tbl>
       <w:tblPr>
@@ -26340,7 +28098,7 @@
               <w:spacing w:after="40"/>
             </w:pPr>
             <w:r>
-              <w:t xml:space="preserve">Docker Desktop; NVIDIA driver + CUDA-enabled PyTorch on the GPU computer; Claude Code</w:t>
+              <w:t xml:space="preserve">Docker Desktop; NVIDIA driver + CUDA-enabled PyTorch on the GPU computer</w:t>
             </w:r>
           </w:p>
         </w:tc>
@@ -26359,7 +28117,7 @@
               <w:spacing w:after="40"/>
             </w:pPr>
             <w:r>
-              <w:t xml:space="preserve">Claude Code also installed on the GPU computer</w:t>
+              <w:t xml:space="preserve">Same</w:t>
             </w:r>
           </w:p>
         </w:tc>
@@ -26388,9 +28146,11 @@
         <w:pStyle w:val="Heading1"/>
         <w:pageBreakBefore/>
       </w:pPr>
+      <w:bookmarkStart w:name="_Toc73" w:id="73"/>
       <w:r>
         <w:t xml:space="preserve">18. Risks and Mitigations</w:t>
       </w:r>
+      <w:bookmarkEnd w:id="73"/>
     </w:p>
     <w:tbl>
       <w:tblPr>
@@ -27090,7 +28850,7 @@
               <w:spacing w:after="40"/>
             </w:pPr>
             <w:r>
-              <w:t xml:space="preserve">Claude Code produces a defect</w:t>
+              <w:t xml:space="preserve">An implementation defect slips through</w:t>
             </w:r>
           </w:p>
         </w:tc>
@@ -27161,9 +28921,11 @@
         <w:pStyle w:val="Heading1"/>
         <w:pageBreakBefore/>
       </w:pPr>
+      <w:bookmarkStart w:name="_Toc74" w:id="74"/>
       <w:r>
         <w:t xml:space="preserve">19. Limitations</w:t>
       </w:r>
+      <w:bookmarkEnd w:id="74"/>
     </w:p>
     <w:p>
       <w:pPr>
@@ -27248,9 +29010,11 @@
         <w:pStyle w:val="Heading1"/>
         <w:pageBreakBefore/>
       </w:pPr>
+      <w:bookmarkStart w:name="_Toc75" w:id="75"/>
       <w:r>
         <w:t xml:space="preserve">20. Ethics and Data Governance</w:t>
       </w:r>
+      <w:bookmarkEnd w:id="75"/>
     </w:p>
     <w:p>
       <w:pPr>
@@ -27322,9 +29086,11 @@
         <w:pStyle w:val="Heading1"/>
         <w:pageBreakBefore/>
       </w:pPr>
+      <w:bookmarkStart w:name="_Toc76" w:id="76"/>
       <w:r>
         <w:t xml:space="preserve">21. Glossary (plain language)</w:t>
       </w:r>
+      <w:bookmarkEnd w:id="76"/>
     </w:p>
     <w:tbl>
       <w:tblPr>
@@ -28099,9 +29865,11 @@
         <w:pStyle w:val="Heading1"/>
         <w:pageBreakBefore/>
       </w:pPr>
+      <w:bookmarkStart w:name="_Toc77" w:id="77"/>
       <w:r>
         <w:t xml:space="preserve">22. References</w:t>
       </w:r>
+      <w:bookmarkEnd w:id="77"/>
     </w:p>
     <w:p>
       <w:pPr>
@@ -28260,7 +30028,7 @@
       </w:r>
     </w:p>
     <w:sectPr>
-      <w:footerReference w:type="default" r:id="rId7"/>
+      <w:footerReference w:type="default" r:id="rId6"/>
       <w:pgSz w:w="11906" w:h="16838" w:orient="portrait"/>
       <w:pgMar w:top="1440" w:right="1440" w:bottom="1440" w:left="1440" w:header="708" w:footer="708" w:gutter="0"/>
       <w:pgNumType/>
@@ -28268,10 +30036,6 @@
     </w:sectPr>
   </w:body>
 </w:document>
-</file>
-
-<file path=word/comments.xml><?xml version="1.0" encoding="utf-8"?>
-<w:comments xmlns:cx="http://schemas.microsoft.com/office/drawing/2014/chartex" xmlns:cx1="http://schemas.microsoft.com/office/drawing/2015/9/8/chartex" xmlns:cx2="http://schemas.microsoft.com/office/drawing/2015/10/21/chartex" xmlns:cx3="http://schemas.microsoft.com/office/drawing/2016/5/9/chartex" xmlns:cx4="http://schemas.microsoft.com/office/drawing/2016/5/10/chartex" xmlns:cx5="http://schemas.microsoft.com/office/drawing/2016/5/11/chartex" xmlns:cx6="http://schemas.microsoft.com/office/drawing/2016/5/12/chartex" xmlns:cx7="http://schemas.microsoft.com/office/drawing/2016/5/13/chartex" xmlns:cx8="http://schemas.microsoft.com/office/drawing/2016/5/14/chartex" xmlns:mc="http://schemas.openxmlformats.org/markup-compatibility/2006" xmlns:aink="http://schemas.microsoft.com/office/drawing/2016/ink" xmlns:am3d="http://schemas.microsoft.com/office/drawing/2017/model3d" xmlns:o="urn:schemas-microsoft-com:office:office" xmlns:r="http://schemas.openxmlformats.org/officeDocument/2006/relationships" xmlns:m="http://schemas.openxmlformats.org/officeDocument/2006/math" xmlns:v="urn:schemas-microsoft-com:vml" xmlns:wp14="http://schemas.microsoft.com/office/word/2010/wordprocessingDrawing" xmlns:wp="http://schemas.openxmlformats.org/drawingml/2006/wordprocessingDrawing" xmlns:w10="urn:schemas-microsoft-com:office:word" xmlns:w="http://schemas.openxmlformats.org/wordprocessingml/2006/main" xmlns:w14="http://schemas.microsoft.com/office/word/2010/wordml" xmlns:w15="http://schemas.microsoft.com/office/word/2012/wordml" xmlns:w16cex="http://schemas.microsoft.com/office/word/2018/wordml/cex" xmlns:w16cid="http://schemas.microsoft.com/office/word/2016/wordml/cid" xmlns:w16="http://schemas.microsoft.com/office/word/2018/wordml" xmlns:w16sdtdh="http://schemas.microsoft.com/office/word/2020/wordml/sdtdatahash" xmlns:w16se="http://schemas.microsoft.com/office/word/2015/wordml/symex" xmlns:wpg="http://schemas.microsoft.com/office/word/2010/wordprocessingGroup" xmlns:wpi="http://schemas.microsoft.com/office/word/2010/wordprocessingInk" xmlns:wne="http://schemas.microsoft.com/office/word/2006/wordml" xmlns:wps="http://schemas.microsoft.com/office/word/2010/wordprocessingShape"/>
 </file>
 
 <file path=word/endnotes.xml><?xml version="1.0" encoding="utf-8"?>
@@ -28381,7 +30145,7 @@
 <w:numbering xmlns:wpc="http://schemas.microsoft.com/office/word/2010/wordprocessingCanvas" xmlns:mc="http://schemas.openxmlformats.org/markup-compatibility/2006" xmlns:o="urn:schemas-microsoft-com:office:office" xmlns:r="http://schemas.openxmlformats.org/officeDocument/2006/relationships" xmlns:m="http://schemas.openxmlformats.org/officeDocument/2006/math" xmlns:v="urn:schemas-microsoft-com:vml" xmlns:wp14="http://schemas.microsoft.com/office/word/2010/wordprocessingDrawing" xmlns:wp="http://schemas.openxmlformats.org/drawingml/2006/wordprocessingDrawing" xmlns:w10="urn:schemas-microsoft-com:office:word" xmlns:w="http://schemas.openxmlformats.org/wordprocessingml/2006/main" xmlns:w14="http://schemas.microsoft.com/office/word/2010/wordml" xmlns:w15="http://schemas.microsoft.com/office/word/2012/wordml" xmlns:wpg="http://schemas.microsoft.com/office/word/2010/wordprocessingGroup" xmlns:wpi="http://schemas.microsoft.com/office/word/2010/wordprocessingInk" xmlns:wne="http://schemas.microsoft.com/office/word/2006/wordml" xmlns:wps="http://schemas.microsoft.com/office/word/2010/wordprocessingShape" mc:Ignorable="w14 w15 wp14">
   <w:abstractNum w:abstractNumId="1" w15:restartNumberingAfterBreak="0">
     <w:multiLevelType w:val="hybridMultilevel"/>
-    <w:lvl w:ilvl="0" w15:tentative="1">
+    <w:lvl w:ilvl="0" w:tentative="1">
       <w:start w:val="1"/>
       <w:numFmt w:val="bullet"/>
       <w:lvlText w:val="●"/>
@@ -28390,7 +30154,7 @@
         <w:ind w:left="720" w:hanging="360"/>
       </w:pPr>
     </w:lvl>
-    <w:lvl w:ilvl="1" w15:tentative="1">
+    <w:lvl w:ilvl="1" w:tentative="1">
       <w:start w:val="1"/>
       <w:numFmt w:val="bullet"/>
       <w:lvlText w:val="○"/>
@@ -28399,7 +30163,7 @@
         <w:ind w:left="1440" w:hanging="360"/>
       </w:pPr>
     </w:lvl>
-    <w:lvl w:ilvl="2" w15:tentative="1">
+    <w:lvl w:ilvl="2" w:tentative="1">
       <w:start w:val="1"/>
       <w:numFmt w:val="bullet"/>
       <w:lvlText w:val="■"/>
@@ -28408,7 +30172,7 @@
         <w:ind w:left="2160" w:hanging="360"/>
       </w:pPr>
     </w:lvl>
-    <w:lvl w:ilvl="3" w15:tentative="1">
+    <w:lvl w:ilvl="3" w:tentative="1">
       <w:start w:val="1"/>
       <w:numFmt w:val="bullet"/>
       <w:lvlText w:val="●"/>
@@ -28417,7 +30181,7 @@
         <w:ind w:left="2880" w:hanging="360"/>
       </w:pPr>
     </w:lvl>
-    <w:lvl w:ilvl="4" w15:tentative="1">
+    <w:lvl w:ilvl="4" w:tentative="1">
       <w:start w:val="1"/>
       <w:numFmt w:val="bullet"/>
       <w:lvlText w:val="○"/>
@@ -28426,7 +30190,7 @@
         <w:ind w:left="3600" w:hanging="360"/>
       </w:pPr>
     </w:lvl>
-    <w:lvl w:ilvl="5" w15:tentative="1">
+    <w:lvl w:ilvl="5" w:tentative="1">
       <w:start w:val="1"/>
       <w:numFmt w:val="bullet"/>
       <w:lvlText w:val="■"/>
@@ -28435,7 +30199,7 @@
         <w:ind w:left="4320" w:hanging="360"/>
       </w:pPr>
     </w:lvl>
-    <w:lvl w:ilvl="6" w15:tentative="1">
+    <w:lvl w:ilvl="6" w:tentative="1">
       <w:start w:val="1"/>
       <w:numFmt w:val="bullet"/>
       <w:lvlText w:val="●"/>
@@ -28444,7 +30208,7 @@
         <w:ind w:left="5040" w:hanging="360"/>
       </w:pPr>
     </w:lvl>
-    <w:lvl w:ilvl="7" w15:tentative="1">
+    <w:lvl w:ilvl="7" w:tentative="1">
       <w:start w:val="1"/>
       <w:numFmt w:val="bullet"/>
       <w:lvlText w:val="●"/>
@@ -28453,7 +30217,7 @@
         <w:ind w:left="5760" w:hanging="360"/>
       </w:pPr>
     </w:lvl>
-    <w:lvl w:ilvl="8" w15:tentative="1">
+    <w:lvl w:ilvl="8" w:tentative="1">
       <w:start w:val="1"/>
       <w:numFmt w:val="bullet"/>
       <w:lvlText w:val="●"/>
@@ -28465,7 +30229,7 @@
   </w:abstractNum>
   <w:abstractNum w:abstractNumId="2" w15:restartNumberingAfterBreak="0">
     <w:multiLevelType w:val="hybridMultilevel"/>
-    <w:lvl w:ilvl="0" w15:tentative="1">
+    <w:lvl w:ilvl="0" w:tentative="1">
       <w:start w:val="1"/>
       <w:numFmt w:val="bullet"/>
       <w:lvlText w:val="•"/>
@@ -28474,7 +30238,7 @@
         <w:ind w:left="540" w:hanging="270"/>
       </w:pPr>
     </w:lvl>
-    <w:lvl w:ilvl="1" w15:tentative="1">
+    <w:lvl w:ilvl="1" w:tentative="1">
       <w:start w:val="1"/>
       <w:numFmt w:val="bullet"/>
       <w:lvlText w:val="◦"/>
@@ -28511,6 +30275,25 @@
     </w:rPrDefault>
     <w:pPrDefault/>
   </w:docDefaults>
+  <w:style w:type="paragraph" w:styleId="Normal" w:default="1">
+    <w:name w:val="Normal"/>
+    <w:qFormat/>
+  </w:style>
+  <w:style w:type="table" w:styleId="TableNormal" w:default="true">
+    <w:name w:val="Normal Table"/>
+    <w:uiPriority w:val="99"/>
+    <w:semiHidden/>
+    <w:unhideWhenUsed/>
+    <w:tblPr>
+      <w:tblInd w:type="dxa" w:w="0"/>
+      <w:tblCellMar>
+        <w:top w:type="dxa" w:w="0"/>
+        <w:left w:type="dxa" w:w="108"/>
+        <w:bottom w:type="dxa" w:w="0"/>
+        <w:right w:type="dxa" w:w="108"/>
+      </w:tblCellMar>
+    </w:tblPr>
+  </w:style>
   <w:style w:type="paragraph" w:styleId="Title">
     <w:name w:val="Title"/>
     <w:basedOn w:val="Normal"/>
@@ -28701,4 +30484,294 @@
     </w:rPr>
   </w:style>
 </w:styles>
+</file>
+
+<file path=word/theme/theme1.xml><?xml version="1.0" encoding="utf-8"?>
+<a:theme xmlns:a="http://schemas.openxmlformats.org/drawingml/2006/main" name="Office Theme">
+  <a:themeElements>
+    <a:clrScheme name="Office">
+      <a:dk1>
+        <a:sysClr val="windowText" lastClr="000000"/>
+      </a:dk1>
+      <a:lt1>
+        <a:sysClr val="window" lastClr="FFFFFF"/>
+      </a:lt1>
+      <a:dk2>
+        <a:srgbClr val="44546A"/>
+      </a:dk2>
+      <a:lt2>
+        <a:srgbClr val="E7E6E6"/>
+      </a:lt2>
+      <a:accent1>
+        <a:srgbClr val="4472C4"/>
+      </a:accent1>
+      <a:accent2>
+        <a:srgbClr val="ED7D31"/>
+      </a:accent2>
+      <a:accent3>
+        <a:srgbClr val="A5A5A5"/>
+      </a:accent3>
+      <a:accent4>
+        <a:srgbClr val="FFC000"/>
+      </a:accent4>
+      <a:accent5>
+        <a:srgbClr val="5B9BD5"/>
+      </a:accent5>
+      <a:accent6>
+        <a:srgbClr val="70AD47"/>
+      </a:accent6>
+      <a:hlink>
+        <a:srgbClr val="0563C1"/>
+      </a:hlink>
+      <a:folHlink>
+        <a:srgbClr val="954F72"/>
+      </a:folHlink>
+    </a:clrScheme>
+    <a:fontScheme name="Office">
+      <a:majorFont>
+        <a:latin typeface="Calibri Light" panose="020F0302020204030204"/>
+        <a:ea typeface=""/>
+        <a:cs typeface=""/>
+        <a:font script="Jpan" typeface="游ゴシック Light"/>
+        <a:font script="Hang" typeface="맑은 고딕"/>
+        <a:font script="Hans" typeface="等线 Light"/>
+        <a:font script="Hant" typeface="新細明體"/>
+        <a:font script="Arab" typeface="Times New Roman"/>
+        <a:font script="Hebr" typeface="Times New Roman"/>
+        <a:font script="Thai" typeface="Angsana New"/>
+        <a:font script="Ethi" typeface="Nyala"/>
+        <a:font script="Beng" typeface="Vrinda"/>
+        <a:font script="Gujr" typeface="Shruti"/>
+        <a:font script="Khmr" typeface="MoolBoran"/>
+        <a:font script="Knda" typeface="Tunga"/>
+        <a:font script="Guru" typeface="Raavi"/>
+        <a:font script="Cans" typeface="Euphemia"/>
+        <a:font script="Cher" typeface="Plantagenet Cherokee"/>
+        <a:font script="Yiii" typeface="Microsoft Yi Baiti"/>
+        <a:font script="Tibt" typeface="Microsoft Himalaya"/>
+        <a:font script="Thaa" typeface="MV Boli"/>
+        <a:font script="Deva" typeface="Mangal"/>
+        <a:font script="Telu" typeface="Gautami"/>
+        <a:font script="Taml" typeface="Latha"/>
+        <a:font script="Syrc" typeface="Estrangelo Edessa"/>
+        <a:font script="Orya" typeface="Kalinga"/>
+        <a:font script="Mlym" typeface="Kartika"/>
+        <a:font script="Laoo" typeface="DokChampa"/>
+        <a:font script="Sinh" typeface="Iskoola Pota"/>
+        <a:font script="Mong" typeface="Mongolian Baiti"/>
+        <a:font script="Viet" typeface="Times New Roman"/>
+        <a:font script="Uigh" typeface="Microsoft Uighur"/>
+        <a:font script="Geor" typeface="Sylfaen"/>
+        <a:font script="Armn" typeface="Arial"/>
+        <a:font script="Bugi" typeface="Leelawadee UI"/>
+        <a:font script="Bopo" typeface="Microsoft JhengHei"/>
+        <a:font script="Java" typeface="Javanese Text"/>
+        <a:font script="Lisu" typeface="Segoe UI"/>
+        <a:font script="Mymr" typeface="Myanmar Text"/>
+        <a:font script="Nkoo" typeface="Ebrima"/>
+        <a:font script="Olck" typeface="Nirmala UI"/>
+        <a:font script="Osma" typeface="Ebrima"/>
+        <a:font script="Phag" typeface="Phagspa"/>
+        <a:font script="Syrn" typeface="Estrangelo Edessa"/>
+        <a:font script="Syrj" typeface="Estrangelo Edessa"/>
+        <a:font script="Syre" typeface="Estrangelo Edessa"/>
+        <a:font script="Sora" typeface="Nirmala UI"/>
+        <a:font script="Tale" typeface="Microsoft Tai Le"/>
+        <a:font script="Talu" typeface="Microsoft New Tai Lue"/>
+        <a:font script="Tfng" typeface="Ebrima"/>
+      </a:majorFont>
+      <a:minorFont>
+        <a:latin typeface="Calibri" panose="020F0502020204030204"/>
+        <a:ea typeface=""/>
+        <a:cs typeface=""/>
+        <a:font script="Jpan" typeface="游明朝"/>
+        <a:font script="Hang" typeface="맑은 고딕"/>
+        <a:font script="Hans" typeface="等线"/>
+        <a:font script="Hant" typeface="新細明體"/>
+        <a:font script="Arab" typeface="Arial"/>
+        <a:font script="Hebr" typeface="Arial"/>
+        <a:font script="Thai" typeface="Cordia New"/>
+        <a:font script="Ethi" typeface="Nyala"/>
+        <a:font script="Beng" typeface="Vrinda"/>
+        <a:font script="Gujr" typeface="Shruti"/>
+        <a:font script="Khmr" typeface="DaunPenh"/>
+        <a:font script="Knda" typeface="Tunga"/>
+        <a:font script="Guru" typeface="Raavi"/>
+        <a:font script="Cans" typeface="Euphemia"/>
+        <a:font script="Cher" typeface="Plantagenet Cherokee"/>
+        <a:font script="Yiii" typeface="Microsoft Yi Baiti"/>
+        <a:font script="Tibt" typeface="Microsoft Himalaya"/>
+        <a:font script="Thaa" typeface="MV Boli"/>
+        <a:font script="Deva" typeface="Mangal"/>
+        <a:font script="Telu" typeface="Gautami"/>
+        <a:font script="Taml" typeface="Latha"/>
+        <a:font script="Syrc" typeface="Estrangelo Edessa"/>
+        <a:font script="Orya" typeface="Kalinga"/>
+        <a:font script="Mlym" typeface="Kartika"/>
+        <a:font script="Laoo" typeface="DokChampa"/>
+        <a:font script="Sinh" typeface="Iskoola Pota"/>
+        <a:font script="Mong" typeface="Mongolian Baiti"/>
+        <a:font script="Viet" typeface="Arial"/>
+        <a:font script="Uigh" typeface="Microsoft Uighur"/>
+        <a:font script="Geor" typeface="Sylfaen"/>
+        <a:font script="Armn" typeface="Arial"/>
+        <a:font script="Bugi" typeface="Leelawadee UI"/>
+        <a:font script="Bopo" typeface="Microsoft JhengHei"/>
+        <a:font script="Java" typeface="Javanese Text"/>
+        <a:font script="Lisu" typeface="Segoe UI"/>
+        <a:font script="Mymr" typeface="Myanmar Text"/>
+        <a:font script="Nkoo" typeface="Ebrima"/>
+        <a:font script="Olck" typeface="Nirmala UI"/>
+        <a:font script="Osma" typeface="Ebrima"/>
+        <a:font script="Phag" typeface="Phagspa"/>
+        <a:font script="Syrn" typeface="Estrangelo Edessa"/>
+        <a:font script="Syrj" typeface="Estrangelo Edessa"/>
+        <a:font script="Syre" typeface="Estrangelo Edessa"/>
+        <a:font script="Sora" typeface="Nirmala UI"/>
+        <a:font script="Tale" typeface="Microsoft Tai Le"/>
+        <a:font script="Talu" typeface="Microsoft New Tai Lue"/>
+        <a:font script="Tfng" typeface="Ebrima"/>
+      </a:minorFont>
+    </a:fontScheme>
+    <a:fmtScheme name="Office">
+      <a:fillStyleLst>
+        <a:solidFill>
+          <a:schemeClr val="phClr"/>
+        </a:solidFill>
+        <a:gradFill rotWithShape="true">
+          <a:gsLst>
+            <a:gs pos="0">
+              <a:schemeClr val="phClr">
+                <a:lumMod val="110000"/>
+                <a:satMod val="105000"/>
+                <a:tint val="67000"/>
+              </a:schemeClr>
+            </a:gs>
+            <a:gs pos="50000">
+              <a:schemeClr val="phClr">
+                <a:lumMod val="105000"/>
+                <a:satMod val="103000"/>
+                <a:tint val="73000"/>
+              </a:schemeClr>
+            </a:gs>
+            <a:gs pos="100000">
+              <a:schemeClr val="phClr">
+                <a:lumMod val="105000"/>
+                <a:satMod val="109000"/>
+                <a:tint val="81000"/>
+              </a:schemeClr>
+            </a:gs>
+          </a:gsLst>
+          <a:lin ang="5400000" scaled="false"/>
+        </a:gradFill>
+        <a:gradFill rotWithShape="true">
+          <a:gsLst>
+            <a:gs pos="0">
+              <a:schemeClr val="phClr">
+                <a:satMod val="103000"/>
+                <a:lumMod val="102000"/>
+                <a:tint val="94000"/>
+              </a:schemeClr>
+            </a:gs>
+            <a:gs pos="50000">
+              <a:schemeClr val="phClr">
+                <a:satMod val="110000"/>
+                <a:lumMod val="100000"/>
+                <a:shade val="100000"/>
+              </a:schemeClr>
+            </a:gs>
+            <a:gs pos="100000">
+              <a:schemeClr val="phClr">
+                <a:lumMod val="99000"/>
+                <a:satMod val="120000"/>
+                <a:shade val="78000"/>
+              </a:schemeClr>
+            </a:gs>
+          </a:gsLst>
+          <a:lin ang="5400000" scaled="false"/>
+        </a:gradFill>
+      </a:fillStyleLst>
+      <a:lnStyleLst>
+        <a:ln w="6350" cap="flat" cmpd="sng" algn="ctr">
+          <a:solidFill>
+            <a:schemeClr val="phClr"/>
+          </a:solidFill>
+          <a:prstDash val="solid"/>
+          <a:miter lim="800000"/>
+        </a:ln>
+        <a:ln w="12700" cap="flat" cmpd="sng" algn="ctr">
+          <a:solidFill>
+            <a:schemeClr val="phClr"/>
+          </a:solidFill>
+          <a:prstDash val="solid"/>
+          <a:miter lim="800000"/>
+        </a:ln>
+        <a:ln w="19050" cap="flat" cmpd="sng" algn="ctr">
+          <a:solidFill>
+            <a:schemeClr val="phClr"/>
+          </a:solidFill>
+          <a:prstDash val="solid"/>
+          <a:miter lim="800000"/>
+        </a:ln>
+      </a:lnStyleLst>
+      <a:effectStyleLst>
+        <a:effectStyle>
+          <a:effectLst/>
+        </a:effectStyle>
+        <a:effectStyle>
+          <a:effectLst/>
+        </a:effectStyle>
+        <a:effectStyle>
+          <a:effectLst>
+            <a:outerShdw blurRad="57150" dist="19050" dir="5400000" algn="ctr" rotWithShape="false">
+              <a:srgbClr val="000000">
+                <a:alpha val="63000"/>
+              </a:srgbClr>
+            </a:outerShdw>
+          </a:effectLst>
+        </a:effectStyle>
+      </a:effectStyleLst>
+      <a:bgFillStyleLst>
+        <a:solidFill>
+          <a:schemeClr val="phClr"/>
+        </a:solidFill>
+        <a:solidFill>
+          <a:schemeClr val="phClr">
+            <a:tint val="95000"/>
+            <a:satMod val="170000"/>
+          </a:schemeClr>
+        </a:solidFill>
+        <a:gradFill rotWithShape="true">
+          <a:gsLst>
+            <a:gs pos="0">
+              <a:schemeClr val="phClr">
+                <a:tint val="93000"/>
+                <a:satMod val="150000"/>
+                <a:shade val="98000"/>
+                <a:lumMod val="102000"/>
+              </a:schemeClr>
+            </a:gs>
+            <a:gs pos="50000">
+              <a:schemeClr val="phClr">
+                <a:tint val="98000"/>
+                <a:satMod val="130000"/>
+                <a:shade val="90000"/>
+                <a:lumMod val="103000"/>
+              </a:schemeClr>
+            </a:gs>
+            <a:gs pos="100000">
+              <a:schemeClr val="phClr">
+                <a:shade val="63000"/>
+                <a:satMod val="120000"/>
+              </a:schemeClr>
+            </a:gs>
+          </a:gsLst>
+          <a:lin ang="5400000" scaled="false"/>
+        </a:gradFill>
+      </a:bgFillStyleLst>
+    </a:fmtScheme>
+  </a:themeElements>
+  <a:objectDefaults/>
+  <a:extraClrSchemeLst/>
+</a:theme>
 </file>
</xml_diff>